<commit_message>
Complete W2-W5 group instructions and publish W4-W6 microstory sequence
</commit_message>
<xml_diff>
--- a/worksheets/W4.docx
+++ b/worksheets/W4.docx
@@ -34,7 +34,7 @@
           <w:color w:val="1A2340"/>
           <w:sz w:val="44"/>
         </w:rPr>
-        <w:t>讓別人看見那一刻</w:t>
+        <w:t>讓你看見這一刻</w:t>
       </w:r>
     </w:p>
     <w:p>
@@ -51,7 +51,7 @@
           <w:color w:val="5B6573"/>
           <w:sz w:val="22"/>
         </w:rPr>
-        <w:t>我以為寫清楚了，讀者真的看見了嗎？</w:t>
+        <w:t>我以為表達清楚了，對方實際接收到什麼？</w:t>
       </w:r>
     </w:p>
     <w:p>
@@ -143,150 +143,19 @@
     </w:p>
     <w:p>
       <w:pPr>
-        <w:keepNext/>
-        <w:keepLines w:val="0"/>
-        <w:spacing w:before="40" w:after="100" w:line="293" w:lineRule="auto"/>
-      </w:pPr>
-      <w:r>
-        <w:rPr>
-          <w:rFonts w:ascii="Arial Unicode MS" w:hAnsi="Arial Unicode MS" w:eastAsia="Arial Unicode MS"/>
-          <w:b/>
-          <w:i w:val="0"/>
-          <w:color w:val="1A2340"/>
-          <w:sz w:val="30"/>
-        </w:rPr>
-        <w:t>本週 0 分練習｜累積學習關卡 1</w:t>
-      </w:r>
-    </w:p>
-    <w:tbl>
-      <w:tblPr>
-        <w:tblW w:type="dxa" w:w="9865"/>
-        <w:jc w:val="left"/>
-        <w:tblLayout w:type="fixed"/>
-        <w:tblLook w:firstColumn="1" w:firstRow="1" w:lastColumn="0" w:lastRow="0" w:noHBand="0" w:noVBand="1" w:val="04A0"/>
-        <w:tblInd w:type="dxa" w:w="0"/>
-      </w:tblPr>
-      <w:tblGrid>
-        <w:gridCol w:w="9865"/>
-      </w:tblGrid>
-      <w:tr>
-        <w:tc>
-          <w:tcPr>
-            <w:tcW w:type="dxa" w:w="9865"/>
-            <w:tcMar>
-              <w:top w:w="100" w:type="dxa"/>
-              <w:start w:w="150" w:type="dxa"/>
-              <w:bottom w:w="100" w:type="dxa"/>
-              <w:end w:w="150" w:type="dxa"/>
-            </w:tcMar>
-            <w:tcBorders>
-              <w:top w:val="nil"/>
-              <w:bottom w:val="nil"/>
-              <w:start w:val="single" w:sz="14" w:space="0" w:color="1D4ED8"/>
-              <w:end w:val="nil"/>
-            </w:tcBorders>
-            <w:shd w:val="clear" w:color="auto" w:fill="F5F7FA"/>
-            <w:vAlign w:val="center"/>
-          </w:tcPr>
-          <w:p>
-            <w:pPr>
-              <w:keepNext w:val="0"/>
-              <w:keepLines w:val="0"/>
-              <w:spacing w:before="0" w:after="80" w:line="293" w:lineRule="auto"/>
-            </w:pPr>
-            <w:r>
-              <w:rPr>
-                <w:rFonts w:ascii="Arial Unicode MS" w:hAnsi="Arial Unicode MS" w:eastAsia="Arial Unicode MS"/>
-                <w:b/>
-                <w:i w:val="0"/>
-                <w:color w:val="1D4ED8"/>
-                <w:sz w:val="22"/>
-              </w:rPr>
-              <w:t>完成</w:t>
-            </w:r>
-            <w:r>
-              <w:rPr>
-                <w:rFonts w:ascii="Arial Unicode MS" w:hAnsi="Arial Unicode MS" w:eastAsia="Arial Unicode MS"/>
-                <w:b w:val="0"/>
-                <w:i w:val="0"/>
-                <w:color w:val="1A2340"/>
-                <w:sz w:val="22"/>
-              </w:rPr>
-              <w:t xml:space="preserve">　寫完約 60 字以上第一版，做出 1–2 個修訂或保留決定。</w:t>
-            </w:r>
-          </w:p>
-          <w:p>
-            <w:pPr>
-              <w:keepNext w:val="0"/>
-              <w:keepLines w:val="0"/>
-              <w:spacing w:before="0" w:after="80" w:line="293" w:lineRule="auto"/>
-            </w:pPr>
-            <w:r>
-              <w:rPr>
-                <w:rFonts w:ascii="Arial Unicode MS" w:hAnsi="Arial Unicode MS" w:eastAsia="Arial Unicode MS"/>
-                <w:b/>
-                <w:i w:val="0"/>
-                <w:color w:val="1D4ED8"/>
-                <w:sz w:val="22"/>
-              </w:rPr>
-              <w:t>證據</w:t>
-            </w:r>
-            <w:r>
-              <w:rPr>
-                <w:rFonts w:ascii="Arial Unicode MS" w:hAnsi="Arial Unicode MS" w:eastAsia="Arial Unicode MS"/>
-                <w:b w:val="0"/>
-                <w:i w:val="0"/>
-                <w:color w:val="1A2340"/>
-                <w:sz w:val="22"/>
-              </w:rPr>
-              <w:t xml:space="preserve">　當測試讀者，寫出至少 2 個由文字讀到的具體內容。</w:t>
-            </w:r>
-          </w:p>
-          <w:p>
-            <w:pPr>
-              <w:keepNext w:val="0"/>
-              <w:keepLines w:val="0"/>
-              <w:spacing w:before="0" w:after="0" w:line="293" w:lineRule="auto"/>
-            </w:pPr>
-            <w:r>
-              <w:rPr>
-                <w:rFonts w:ascii="Arial Unicode MS" w:hAnsi="Arial Unicode MS" w:eastAsia="Arial Unicode MS"/>
-                <w:b/>
-                <w:i w:val="0"/>
-                <w:color w:val="1D4ED8"/>
-                <w:sz w:val="22"/>
-              </w:rPr>
-              <w:t>判斷</w:t>
-            </w:r>
-            <w:r>
-              <w:rPr>
-                <w:rFonts w:ascii="Arial Unicode MS" w:hAnsi="Arial Unicode MS" w:eastAsia="Arial Unicode MS"/>
-                <w:b w:val="0"/>
-                <w:i w:val="0"/>
-                <w:color w:val="1A2340"/>
-                <w:sz w:val="22"/>
-              </w:rPr>
-              <w:t xml:space="preserve">　對照封存原意與讀者回報，說明最後決定與段落重點。</w:t>
-            </w:r>
-          </w:p>
-        </w:tc>
-      </w:tr>
-    </w:tbl>
-    <w:p>
-      <w:pPr>
         <w:keepNext w:val="0"/>
         <w:keepLines w:val="0"/>
-        <w:spacing w:before="60" w:after="40" w:line="293" w:lineRule="auto"/>
+        <w:spacing w:before="0" w:after="60" w:line="293" w:lineRule="auto"/>
       </w:pPr>
       <w:r>
         <w:rPr>
           <w:rFonts w:ascii="Arial Unicode MS" w:hAnsi="Arial Unicode MS" w:eastAsia="Arial Unicode MS"/>
           <w:b w:val="0"/>
           <w:i w:val="0"/>
-          <w:color w:val="5B6573"/>
+          <w:color w:val="1A2340"/>
           <w:sz w:val="22"/>
         </w:rPr>
-        <w:t>下課前整本收回保管；W5 再用 W2–W3 與本週原作查核學習關卡 1。不以文筆、素材私密程度或公開分享判定；AI 不取代真人測讀，若另用仍須看懂、核對並自己負責。</w:t>
+        <w:t>個人創作故事圖卡：選擇或創作一個片刻，找出原意與真人理解的落差。真實、改編、虛構同標準。本週 0 分練習，累積學習關卡 1，W5 查核。</w:t>
       </w:r>
     </w:p>
     <w:p>
@@ -323,41 +192,41 @@
           <w:color w:val="1A2340"/>
           <w:sz w:val="30"/>
         </w:rPr>
-        <w:t>先選可以交換的素材</w:t>
+        <w:t>先看共同材料，保留初答</w:t>
       </w:r>
     </w:p>
     <w:p>
       <w:pPr>
         <w:keepNext w:val="0"/>
         <w:keepLines w:val="0"/>
-        <w:spacing w:before="0" w:after="40" w:line="293" w:lineRule="auto"/>
+        <w:spacing w:before="0" w:after="60" w:line="293" w:lineRule="auto"/>
       </w:pPr>
       <w:r>
         <w:rPr>
           <w:rFonts w:ascii="Arial Unicode MS" w:hAnsi="Arial Unicode MS" w:eastAsia="Arial Unicode MS"/>
-          <w:b/>
+          <w:b w:val="0"/>
           <w:i w:val="0"/>
           <w:color w:val="1A2340"/>
           <w:sz w:val="22"/>
         </w:rPr>
-        <w:t>□ 我擴寫願意交換的 W3 原文　　□ 我改寫老師的紙團球 A 版</w:t>
+        <w:t>局部：我看成＿＿＿＿＿＿＿，畫面根據＿＿＿＿＿＿＿。</w:t>
       </w:r>
     </w:p>
     <w:p>
       <w:pPr>
         <w:keepNext w:val="0"/>
         <w:keepLines w:val="0"/>
-        <w:spacing w:before="0" w:after="40" w:line="293" w:lineRule="auto"/>
+        <w:spacing w:before="0" w:after="60" w:line="293" w:lineRule="auto"/>
       </w:pPr>
       <w:r>
         <w:rPr>
           <w:rFonts w:ascii="Arial Unicode MS" w:hAnsi="Arial Unicode MS" w:eastAsia="Arial Unicode MS"/>
           <w:b w:val="0"/>
           <w:i w:val="0"/>
-          <w:color w:val="5B6573"/>
+          <w:color w:val="1A2340"/>
           <w:sz w:val="22"/>
         </w:rPr>
-        <w:t>保留 W3 選的關鍵細節。人物可改稱呼，私密細節可拿掉；改用 A 版保留相同的學習關卡 1 證據機會。</w:t>
+        <w:t>完整：我改／保留＿＿＿＿＿，新增線索＿＿＿＿＿＿＿。</w:t>
       </w:r>
     </w:p>
     <w:p>
@@ -394,243 +263,15 @@
           <w:color w:val="1A2340"/>
           <w:sz w:val="30"/>
         </w:rPr>
-        <w:t>讓讀者看見的三個工具</w:t>
+        <w:t>自己的原意與必要線索</w:t>
       </w:r>
     </w:p>
-    <w:tbl>
-      <w:tblPr>
-        <w:tblW w:type="dxa" w:w="9865"/>
-        <w:jc w:val="left"/>
-        <w:tblLayout w:type="fixed"/>
-        <w:tblLook w:firstColumn="1" w:firstRow="1" w:lastColumn="0" w:lastRow="0" w:noHBand="0" w:noVBand="1" w:val="04A0"/>
-        <w:tblInd w:type="dxa" w:w="0"/>
-      </w:tblPr>
-      <w:tblGrid>
-        <w:gridCol w:w="3288"/>
-        <w:gridCol w:w="3288"/>
-        <w:gridCol w:w="3289"/>
-      </w:tblGrid>
-      <w:tr>
-        <w:tc>
-          <w:tcPr>
-            <w:tcW w:type="dxa" w:w="3288"/>
-            <w:vAlign w:val="center"/>
-            <w:tcMar>
-              <w:top w:w="80" w:type="dxa"/>
-              <w:start w:w="100" w:type="dxa"/>
-              <w:bottom w:w="80" w:type="dxa"/>
-              <w:end w:w="100" w:type="dxa"/>
-            </w:tcMar>
-            <w:shd w:val="clear" w:color="auto" w:fill="F5F7FA"/>
-            <w:tcBorders>
-              <w:top w:val="single" w:sz="7" w:space="0" w:color="1D4ED8"/>
-              <w:bottom w:val="nil"/>
-              <w:start w:val="nil"/>
-              <w:end w:val="single" w:sz="4" w:space="0" w:color="CBD5E1"/>
-            </w:tcBorders>
-          </w:tcPr>
-          <w:p>
-            <w:pPr>
-              <w:spacing w:before="0" w:after="0"/>
-              <w:jc w:val="center"/>
-            </w:pPr>
-            <w:r>
-              <w:rPr>
-                <w:rFonts w:ascii="Arial Unicode MS" w:hAnsi="Arial Unicode MS" w:eastAsia="Arial Unicode MS"/>
-                <w:b/>
-                <w:i w:val="0"/>
-                <w:color w:val="1D4ED8"/>
-                <w:sz w:val="22"/>
-              </w:rPr>
-              <w:t>有地方</w:t>
-            </w:r>
-            <w:r>
-              <w:rPr>
-                <w:rFonts w:ascii="Arial Unicode MS" w:hAnsi="Arial Unicode MS" w:eastAsia="Arial Unicode MS"/>
-                <w:b w:val="0"/>
-                <w:i w:val="0"/>
-                <w:color w:val="5B6573"/>
-                <w:sz w:val="18"/>
-              </w:rPr>
-              <w:br/>
-              <w:t>人在哪裡？周圍有什麼？</w:t>
-            </w:r>
-          </w:p>
-        </w:tc>
-        <w:tc>
-          <w:tcPr>
-            <w:tcW w:type="dxa" w:w="3288"/>
-            <w:vAlign w:val="center"/>
-            <w:tcMar>
-              <w:top w:w="80" w:type="dxa"/>
-              <w:start w:w="100" w:type="dxa"/>
-              <w:bottom w:w="80" w:type="dxa"/>
-              <w:end w:w="100" w:type="dxa"/>
-            </w:tcMar>
-            <w:shd w:val="clear" w:color="auto" w:fill="F5F7FA"/>
-            <w:tcBorders>
-              <w:top w:val="single" w:sz="7" w:space="0" w:color="1D4ED8"/>
-              <w:bottom w:val="nil"/>
-              <w:start w:val="nil"/>
-              <w:end w:val="single" w:sz="4" w:space="0" w:color="CBD5E1"/>
-            </w:tcBorders>
-          </w:tcPr>
-          <w:p>
-            <w:pPr>
-              <w:spacing w:before="0" w:after="0"/>
-              <w:jc w:val="center"/>
-            </w:pPr>
-            <w:r>
-              <w:rPr>
-                <w:rFonts w:ascii="Arial Unicode MS" w:hAnsi="Arial Unicode MS" w:eastAsia="Arial Unicode MS"/>
-                <w:b/>
-                <w:i w:val="0"/>
-                <w:color w:val="1D4ED8"/>
-                <w:sz w:val="22"/>
-              </w:rPr>
-              <w:t>有動作</w:t>
-            </w:r>
-            <w:r>
-              <w:rPr>
-                <w:rFonts w:ascii="Arial Unicode MS" w:hAnsi="Arial Unicode MS" w:eastAsia="Arial Unicode MS"/>
-                <w:b w:val="0"/>
-                <w:i w:val="0"/>
-                <w:color w:val="5B6573"/>
-                <w:sz w:val="18"/>
-              </w:rPr>
-              <w:br/>
-              <w:t>誰做了什麼？有什麼聲音？</w:t>
-            </w:r>
-          </w:p>
-        </w:tc>
-        <w:tc>
-          <w:tcPr>
-            <w:tcW w:type="dxa" w:w="3289"/>
-            <w:vAlign w:val="center"/>
-            <w:tcMar>
-              <w:top w:w="80" w:type="dxa"/>
-              <w:start w:w="100" w:type="dxa"/>
-              <w:bottom w:w="80" w:type="dxa"/>
-              <w:end w:w="100" w:type="dxa"/>
-            </w:tcMar>
-            <w:shd w:val="clear" w:color="auto" w:fill="F5F7FA"/>
-            <w:tcBorders>
-              <w:top w:val="single" w:sz="7" w:space="0" w:color="1D4ED8"/>
-              <w:bottom w:val="nil"/>
-              <w:start w:val="nil"/>
-              <w:end w:val="single" w:sz="4" w:space="0" w:color="CBD5E1"/>
-            </w:tcBorders>
-          </w:tcPr>
-          <w:p>
-            <w:pPr>
-              <w:spacing w:before="0" w:after="0"/>
-              <w:jc w:val="center"/>
-            </w:pPr>
-            <w:r>
-              <w:rPr>
-                <w:rFonts w:ascii="Arial Unicode MS" w:hAnsi="Arial Unicode MS" w:eastAsia="Arial Unicode MS"/>
-                <w:b/>
-                <w:i w:val="0"/>
-                <w:color w:val="1D4ED8"/>
-                <w:sz w:val="22"/>
-              </w:rPr>
-              <w:t>有變化</w:t>
-            </w:r>
-            <w:r>
-              <w:rPr>
-                <w:rFonts w:ascii="Arial Unicode MS" w:hAnsi="Arial Unicode MS" w:eastAsia="Arial Unicode MS"/>
-                <w:b w:val="0"/>
-                <w:i w:val="0"/>
-                <w:color w:val="5B6573"/>
-                <w:sz w:val="18"/>
-              </w:rPr>
-              <w:br/>
-              <w:t>前後哪裡不同？哪一刻改變了？</w:t>
-            </w:r>
-          </w:p>
-        </w:tc>
-      </w:tr>
-    </w:tbl>
     <w:p>
       <w:pPr>
         <w:keepNext w:val="0"/>
         <w:keepLines w:val="0"/>
-        <w:spacing w:before="40" w:after="40" w:line="293" w:lineRule="auto"/>
+        <w:spacing w:before="0" w:after="60" w:line="293" w:lineRule="auto"/>
       </w:pPr>
-      <w:r>
-        <w:rPr>
-          <w:rFonts w:ascii="Arial Unicode MS" w:hAnsi="Arial Unicode MS" w:eastAsia="Arial Unicode MS"/>
-          <w:b w:val="0"/>
-          <w:i w:val="0"/>
-          <w:color w:val="5B6573"/>
-          <w:sz w:val="22"/>
-        </w:rPr>
-        <w:t>不用三種全塞；選最能幫讀者看見的 2–3 個就好。</w:t>
-      </w:r>
-    </w:p>
-    <w:p>
-      <w:pPr>
-        <w:keepNext/>
-        <w:keepLines w:val="0"/>
-        <w:spacing w:before="100" w:after="100" w:line="293" w:lineRule="auto"/>
-      </w:pPr>
-      <w:r>
-        <w:rPr>
-          <w:rFonts w:ascii="JetBrains Mono" w:hAnsi="JetBrains Mono" w:eastAsia="Arial Unicode MS"/>
-          <w:b/>
-          <w:i w:val="0"/>
-          <w:color w:val="1D4ED8"/>
-          <w:sz w:val="30"/>
-        </w:rPr>
-        <w:t>03</w:t>
-      </w:r>
-      <w:r>
-        <w:rPr>
-          <w:rFonts w:ascii="Arial Unicode MS" w:hAnsi="Arial Unicode MS" w:eastAsia="Arial Unicode MS"/>
-          <w:b w:val="0"/>
-          <w:i w:val="0"/>
-          <w:color w:val="1D4ED8"/>
-          <w:sz w:val="30"/>
-        </w:rPr>
-        <w:t xml:space="preserve">  </w:t>
-      </w:r>
-      <w:r>
-        <w:rPr>
-          <w:rFonts w:ascii="Arial Unicode MS" w:hAnsi="Arial Unicode MS" w:eastAsia="Arial Unicode MS"/>
-          <w:b/>
-          <w:i w:val="0"/>
-          <w:color w:val="1A2340"/>
-          <w:sz w:val="30"/>
-        </w:rPr>
-        <w:t>我的第一版｜約 60 字以上</w:t>
-      </w:r>
-    </w:p>
-    <w:p>
-      <w:pPr>
-        <w:keepNext/>
-        <w:keepLines w:val="0"/>
-        <w:spacing w:before="0" w:after="20" w:line="293" w:lineRule="auto"/>
-      </w:pPr>
-      <w:r>
-        <w:rPr>
-          <w:rFonts w:ascii="Arial Unicode MS" w:hAnsi="Arial Unicode MS" w:eastAsia="Arial Unicode MS"/>
-          <w:b/>
-          <w:i w:val="0"/>
-          <w:color w:val="1D4ED8"/>
-          <w:sz w:val="22"/>
-        </w:rPr>
-        <w:t>課堂必寫</w:t>
-      </w:r>
-      <w:r>
-        <w:rPr>
-          <w:rFonts w:ascii="Arial Unicode MS" w:hAnsi="Arial Unicode MS" w:eastAsia="Arial Unicode MS"/>
-          <w:b w:val="0"/>
-          <w:i w:val="0"/>
-          <w:color w:val="7B8491"/>
-          <w:sz w:val="22"/>
-        </w:rPr>
-        <w:t xml:space="preserve">  ｜  </w:t>
-      </w:r>
       <w:r>
         <w:rPr>
           <w:rFonts w:ascii="Arial Unicode MS" w:hAnsi="Arial Unicode MS" w:eastAsia="Arial Unicode MS"/>
@@ -639,144 +280,15 @@
           <w:color w:val="1A2340"/>
           <w:sz w:val="22"/>
         </w:rPr>
-        <w:t>拿出 W3 那段，用地方、動作、變化擴寫；重點不是湊字數。</w:t>
-      </w:r>
-    </w:p>
-    <w:tbl>
-      <w:tblPr>
-        <w:tblW w:type="dxa" w:w="9865"/>
-        <w:jc w:val="left"/>
-        <w:tblLayout w:type="fixed"/>
-        <w:tblLook w:firstColumn="1" w:firstRow="1" w:lastColumn="0" w:lastRow="0" w:noHBand="0" w:noVBand="1" w:val="04A0"/>
-        <w:tblInd w:type="dxa" w:w="0"/>
-      </w:tblPr>
-      <w:tblGrid>
-        <w:gridCol w:w="9865"/>
-      </w:tblGrid>
-      <w:tr>
-        <w:trPr>
-          <w:trHeight w:val="510" w:hRule="atLeast"/>
-        </w:trPr>
-        <w:tc>
-          <w:tcPr>
-            <w:tcW w:type="dxa" w:w="9865"/>
-            <w:tcMar>
-              <w:top w:w="0" w:type="dxa"/>
-              <w:start w:w="0" w:type="dxa"/>
-              <w:bottom w:w="0" w:type="dxa"/>
-              <w:end w:w="0" w:type="dxa"/>
-            </w:tcMar>
-            <w:tcBorders>
-              <w:top w:val="nil"/>
-              <w:bottom w:val="single" w:sz="5" w:space="0" w:color="CBD5E1"/>
-              <w:start w:val="nil"/>
-              <w:end w:val="nil"/>
-            </w:tcBorders>
-          </w:tcPr>
-          <w:p>
-            <w:pPr>
-              <w:spacing w:before="0" w:after="0" w:line="240" w:lineRule="auto"/>
-            </w:pPr>
-            <w:r>
-              <w:t xml:space="preserve"> </w:t>
-            </w:r>
-          </w:p>
-        </w:tc>
-      </w:tr>
-      <w:tr>
-        <w:trPr>
-          <w:trHeight w:val="510" w:hRule="atLeast"/>
-        </w:trPr>
-        <w:tc>
-          <w:tcPr>
-            <w:tcW w:type="dxa" w:w="9865"/>
-            <w:tcMar>
-              <w:top w:w="0" w:type="dxa"/>
-              <w:start w:w="0" w:type="dxa"/>
-              <w:bottom w:w="0" w:type="dxa"/>
-              <w:end w:w="0" w:type="dxa"/>
-            </w:tcMar>
-            <w:tcBorders>
-              <w:top w:val="nil"/>
-              <w:bottom w:val="single" w:sz="5" w:space="0" w:color="CBD5E1"/>
-              <w:start w:val="nil"/>
-              <w:end w:val="nil"/>
-            </w:tcBorders>
-          </w:tcPr>
-          <w:p>
-            <w:pPr>
-              <w:spacing w:before="0" w:after="0" w:line="240" w:lineRule="auto"/>
-            </w:pPr>
-            <w:r>
-              <w:t xml:space="preserve"> </w:t>
-            </w:r>
-          </w:p>
-        </w:tc>
-      </w:tr>
-    </w:tbl>
-    <w:p>
-      <w:pPr>
-        <w:keepNext/>
-        <w:keepLines w:val="0"/>
-        <w:spacing w:before="40" w:after="100" w:line="293" w:lineRule="auto"/>
-      </w:pPr>
-      <w:r>
-        <w:rPr>
-          <w:rFonts w:ascii="JetBrains Mono" w:hAnsi="JetBrains Mono" w:eastAsia="Arial Unicode MS"/>
-          <w:b/>
-          <w:i w:val="0"/>
-          <w:color w:val="1D4ED8"/>
-          <w:sz w:val="30"/>
-        </w:rPr>
-        <w:t>04</w:t>
-      </w:r>
-      <w:r>
-        <w:rPr>
-          <w:rFonts w:ascii="Arial Unicode MS" w:hAnsi="Arial Unicode MS" w:eastAsia="Arial Unicode MS"/>
-          <w:b w:val="0"/>
-          <w:i w:val="0"/>
-          <w:color w:val="1D4ED8"/>
-          <w:sz w:val="30"/>
-        </w:rPr>
-        <w:t xml:space="preserve">  </w:t>
-      </w:r>
-      <w:r>
-        <w:rPr>
-          <w:rFonts w:ascii="Arial Unicode MS" w:hAnsi="Arial Unicode MS" w:eastAsia="Arial Unicode MS"/>
-          <w:b/>
-          <w:i w:val="0"/>
-          <w:color w:val="1A2340"/>
-          <w:sz w:val="30"/>
-        </w:rPr>
-        <w:t>原意｜先寫，摺起來</w:t>
+        <w:t>□ 自己的 W3／觀察　□ 公開素材改編　□ 起點卡／自編故事</w:t>
       </w:r>
     </w:p>
     <w:p>
       <w:pPr>
-        <w:keepNext/>
+        <w:keepNext w:val="0"/>
         <w:keepLines w:val="0"/>
-        <w:spacing w:before="0" w:after="20" w:line="293" w:lineRule="auto"/>
+        <w:spacing w:before="0" w:after="60" w:line="293" w:lineRule="auto"/>
       </w:pPr>
-      <w:r>
-        <w:rPr>
-          <w:rFonts w:ascii="Arial Unicode MS" w:hAnsi="Arial Unicode MS" w:eastAsia="Arial Unicode MS"/>
-          <w:b/>
-          <w:i w:val="0"/>
-          <w:color w:val="5B6573"/>
-          <w:sz w:val="22"/>
-        </w:rPr>
-        <w:t>回饋前先寫</w:t>
-      </w:r>
-      <w:r>
-        <w:rPr>
-          <w:rFonts w:ascii="Arial Unicode MS" w:hAnsi="Arial Unicode MS" w:eastAsia="Arial Unicode MS"/>
-          <w:b w:val="0"/>
-          <w:i w:val="0"/>
-          <w:color w:val="7B8491"/>
-          <w:sz w:val="22"/>
-        </w:rPr>
-        <w:t xml:space="preserve">  ｜  </w:t>
-      </w:r>
       <w:r>
         <w:rPr>
           <w:rFonts w:ascii="Arial Unicode MS" w:hAnsi="Arial Unicode MS" w:eastAsia="Arial Unicode MS"/>
@@ -785,319 +297,15 @@
           <w:color w:val="1A2340"/>
           <w:sz w:val="22"/>
         </w:rPr>
-        <w:t>我最想讓人看見的是：</w:t>
+        <w:t>素材位置／卡名＿＿＿＿＿　□ 真實　□ 改編　□ 虛構。換材不用說明。</w:t>
       </w:r>
     </w:p>
     <w:p>
       <w:pPr>
         <w:keepNext w:val="0"/>
         <w:keepLines w:val="0"/>
-        <w:spacing w:before="0" w:after="0" w:line="293" w:lineRule="auto"/>
-      </w:pPr>
-      <w:r>
-        <w:rPr>
-          <w:rFonts w:ascii="JetBrains Mono" w:hAnsi="JetBrains Mono" w:eastAsia="Arial Unicode MS"/>
-          <w:b w:val="0"/>
-          <w:i w:val="0"/>
-          <w:color w:val="1A2340"/>
-          <w:sz w:val="22"/>
-        </w:rPr>
-        <w:t>________________________________________________________________________________</w:t>
-      </w:r>
-    </w:p>
-    <w:p>
-      <w:pPr>
-        <w:keepNext w:val="0"/>
-        <w:keepLines w:val="0"/>
-        <w:spacing w:before="20" w:after="0" w:line="293" w:lineRule="auto"/>
-        <w:jc w:val="center"/>
-      </w:pPr>
-      <w:r>
-        <w:rPr>
-          <w:rFonts w:ascii="Arial Unicode MS" w:hAnsi="Arial Unicode MS" w:eastAsia="Arial Unicode MS"/>
-          <w:b w:val="0"/>
-          <w:i w:val="0"/>
-          <w:color w:val="7B8491"/>
-          <w:sz w:val="18"/>
-        </w:rPr>
-        <w:t>──────── 沿這裡向內摺，拿到回報後才打開 ────────</w:t>
-      </w:r>
-    </w:p>
-    <w:p>
-      <w:pPr>
-        <w:keepNext/>
-        <w:keepLines w:val="0"/>
-        <w:pageBreakBefore/>
         <w:spacing w:before="0" w:after="60" w:line="293" w:lineRule="auto"/>
       </w:pPr>
-      <w:r>
-        <w:rPr>
-          <w:rFonts w:ascii="JetBrains Mono" w:hAnsi="JetBrains Mono" w:eastAsia="Arial Unicode MS"/>
-          <w:b/>
-          <w:i w:val="0"/>
-          <w:color w:val="1D4ED8"/>
-          <w:sz w:val="22"/>
-        </w:rPr>
-        <w:t>W4 / 02</w:t>
-      </w:r>
-    </w:p>
-    <w:p>
-      <w:pPr>
-        <w:keepNext/>
-        <w:keepLines w:val="0"/>
-        <w:spacing w:before="0" w:after="80" w:line="252" w:lineRule="auto"/>
-      </w:pPr>
-      <w:r>
-        <w:rPr>
-          <w:rFonts w:ascii="Arial Unicode MS" w:hAnsi="Arial Unicode MS" w:eastAsia="Arial Unicode MS"/>
-          <w:b/>
-          <w:i w:val="0"/>
-          <w:color w:val="1A2340"/>
-          <w:sz w:val="44"/>
-        </w:rPr>
-        <w:t>當一個測試讀者</w:t>
-      </w:r>
-    </w:p>
-    <w:p>
-      <w:pPr>
-        <w:keepNext w:val="0"/>
-        <w:keepLines w:val="0"/>
-        <w:spacing w:before="0" w:after="140" w:line="293" w:lineRule="auto"/>
-      </w:pPr>
-      <w:r>
-        <w:rPr>
-          <w:rFonts w:ascii="Arial Unicode MS" w:hAnsi="Arial Unicode MS" w:eastAsia="Arial Unicode MS"/>
-          <w:b w:val="0"/>
-          <w:i w:val="0"/>
-          <w:color w:val="5B6573"/>
-          <w:sz w:val="22"/>
-        </w:rPr>
-        <w:t>不替作者打分數，只回報文字讓你實際收到什麼。</w:t>
-      </w:r>
-    </w:p>
-    <w:p>
-      <w:pPr>
-        <w:keepNext/>
-        <w:keepLines w:val="0"/>
-        <w:spacing w:before="40" w:after="100" w:line="293" w:lineRule="auto"/>
-      </w:pPr>
-      <w:r>
-        <w:rPr>
-          <w:rFonts w:ascii="JetBrains Mono" w:hAnsi="JetBrains Mono" w:eastAsia="Arial Unicode MS"/>
-          <w:b/>
-          <w:i w:val="0"/>
-          <w:color w:val="1D4ED8"/>
-          <w:sz w:val="30"/>
-        </w:rPr>
-        <w:t>05</w:t>
-      </w:r>
-      <w:r>
-        <w:rPr>
-          <w:rFonts w:ascii="Arial Unicode MS" w:hAnsi="Arial Unicode MS" w:eastAsia="Arial Unicode MS"/>
-          <w:b w:val="0"/>
-          <w:i w:val="0"/>
-          <w:color w:val="1D4ED8"/>
-          <w:sz w:val="30"/>
-        </w:rPr>
-        <w:t xml:space="preserve">  </w:t>
-      </w:r>
-      <w:r>
-        <w:rPr>
-          <w:rFonts w:ascii="Arial Unicode MS" w:hAnsi="Arial Unicode MS" w:eastAsia="Arial Unicode MS"/>
-          <w:b/>
-          <w:i w:val="0"/>
-          <w:color w:val="1A2340"/>
-          <w:sz w:val="30"/>
-        </w:rPr>
-        <w:t>交換界線</w:t>
-      </w:r>
-    </w:p>
-    <w:tbl>
-      <w:tblPr>
-        <w:tblW w:type="dxa" w:w="9865"/>
-        <w:jc w:val="left"/>
-        <w:tblLayout w:type="fixed"/>
-        <w:tblLook w:firstColumn="1" w:firstRow="1" w:lastColumn="0" w:lastRow="0" w:noHBand="0" w:noVBand="1" w:val="04A0"/>
-        <w:tblInd w:type="dxa" w:w="0"/>
-      </w:tblPr>
-      <w:tblGrid>
-        <w:gridCol w:w="9865"/>
-      </w:tblGrid>
-      <w:tr>
-        <w:tc>
-          <w:tcPr>
-            <w:tcW w:type="dxa" w:w="9865"/>
-            <w:tcMar>
-              <w:top w:w="100" w:type="dxa"/>
-              <w:start w:w="150" w:type="dxa"/>
-              <w:bottom w:w="100" w:type="dxa"/>
-              <w:end w:w="150" w:type="dxa"/>
-            </w:tcMar>
-            <w:tcBorders>
-              <w:top w:val="nil"/>
-              <w:bottom w:val="nil"/>
-              <w:start w:val="single" w:sz="14" w:space="0" w:color="1D4ED8"/>
-              <w:end w:val="nil"/>
-            </w:tcBorders>
-            <w:shd w:val="clear" w:color="auto" w:fill="F5F7FA"/>
-            <w:vAlign w:val="center"/>
-          </w:tcPr>
-          <w:p>
-            <w:pPr>
-              <w:keepNext w:val="0"/>
-              <w:keepLines w:val="0"/>
-              <w:spacing w:before="0" w:after="80" w:line="293" w:lineRule="auto"/>
-            </w:pPr>
-            <w:r>
-              <w:rPr>
-                <w:rFonts w:ascii="Arial Unicode MS" w:hAnsi="Arial Unicode MS" w:eastAsia="Arial Unicode MS"/>
-                <w:b/>
-                <w:i w:val="0"/>
-                <w:color w:val="1D4ED8"/>
-                <w:sz w:val="22"/>
-              </w:rPr>
-              <w:t>可以</w:t>
-            </w:r>
-            <w:r>
-              <w:rPr>
-                <w:rFonts w:ascii="Arial Unicode MS" w:hAnsi="Arial Unicode MS" w:eastAsia="Arial Unicode MS"/>
-                <w:b w:val="0"/>
-                <w:i w:val="0"/>
-                <w:color w:val="1A2340"/>
-                <w:sz w:val="22"/>
-              </w:rPr>
-              <w:t xml:space="preserve">　指出文字讓你看到或沒看到什麼；看完就把這一頁還給本人。</w:t>
-            </w:r>
-          </w:p>
-          <w:p>
-            <w:pPr>
-              <w:keepNext w:val="0"/>
-              <w:keepLines w:val="0"/>
-              <w:spacing w:before="0" w:after="0" w:line="293" w:lineRule="auto"/>
-            </w:pPr>
-            <w:r>
-              <w:rPr>
-                <w:rFonts w:ascii="Arial Unicode MS" w:hAnsi="Arial Unicode MS" w:eastAsia="Arial Unicode MS"/>
-                <w:b/>
-                <w:i w:val="0"/>
-                <w:color w:val="C2414D"/>
-                <w:sz w:val="22"/>
-              </w:rPr>
-              <w:t>不要</w:t>
-            </w:r>
-            <w:r>
-              <w:rPr>
-                <w:rFonts w:ascii="Arial Unicode MS" w:hAnsi="Arial Unicode MS" w:eastAsia="Arial Unicode MS"/>
-                <w:b w:val="0"/>
-                <w:i w:val="0"/>
-                <w:color w:val="1A2340"/>
-                <w:sz w:val="22"/>
-              </w:rPr>
-              <w:t xml:space="preserve">　追問人物是誰、拍照、轉傳、嘲笑、猜測或替作者解釋。</w:t>
-            </w:r>
-          </w:p>
-        </w:tc>
-      </w:tr>
-    </w:tbl>
-    <w:p>
-      <w:pPr>
-        <w:keepNext w:val="0"/>
-        <w:keepLines w:val="0"/>
-        <w:spacing w:before="60" w:after="40" w:line="293" w:lineRule="auto"/>
-      </w:pPr>
-      <w:r>
-        <w:rPr>
-          <w:rFonts w:ascii="Arial Unicode MS" w:hAnsi="Arial Unicode MS" w:eastAsia="Arial Unicode MS"/>
-          <w:b w:val="0"/>
-          <w:i w:val="0"/>
-          <w:color w:val="5B6573"/>
-          <w:sz w:val="22"/>
-        </w:rPr>
-        <w:t>跟我交換的測試讀者座號：</w:t>
-      </w:r>
-      <w:r>
-        <w:rPr>
-          <w:rFonts w:ascii="JetBrains Mono" w:hAnsi="JetBrains Mono" w:eastAsia="Arial Unicode MS"/>
-          <w:b w:val="0"/>
-          <w:i w:val="0"/>
-          <w:color w:val="1A2340"/>
-          <w:sz w:val="22"/>
-        </w:rPr>
-        <w:t>________</w:t>
-      </w:r>
-      <w:r>
-        <w:rPr>
-          <w:rFonts w:ascii="Arial Unicode MS" w:hAnsi="Arial Unicode MS" w:eastAsia="Arial Unicode MS"/>
-          <w:b w:val="0"/>
-          <w:i w:val="0"/>
-          <w:color w:val="5B6573"/>
-          <w:sz w:val="22"/>
-        </w:rPr>
-      </w:r>
-    </w:p>
-    <w:p>
-      <w:pPr>
-        <w:keepNext/>
-        <w:keepLines w:val="0"/>
-        <w:spacing w:before="120" w:after="100" w:line="293" w:lineRule="auto"/>
-      </w:pPr>
-      <w:r>
-        <w:rPr>
-          <w:rFonts w:ascii="JetBrains Mono" w:hAnsi="JetBrains Mono" w:eastAsia="Arial Unicode MS"/>
-          <w:b/>
-          <w:i w:val="0"/>
-          <w:color w:val="1D4ED8"/>
-          <w:sz w:val="30"/>
-        </w:rPr>
-        <w:t>06</w:t>
-      </w:r>
-      <w:r>
-        <w:rPr>
-          <w:rFonts w:ascii="Arial Unicode MS" w:hAnsi="Arial Unicode MS" w:eastAsia="Arial Unicode MS"/>
-          <w:b w:val="0"/>
-          <w:i w:val="0"/>
-          <w:color w:val="1D4ED8"/>
-          <w:sz w:val="30"/>
-        </w:rPr>
-        <w:t xml:space="preserve">  </w:t>
-      </w:r>
-      <w:r>
-        <w:rPr>
-          <w:rFonts w:ascii="Arial Unicode MS" w:hAnsi="Arial Unicode MS" w:eastAsia="Arial Unicode MS"/>
-          <w:b/>
-          <w:i w:val="0"/>
-          <w:color w:val="1A2340"/>
-          <w:sz w:val="30"/>
-        </w:rPr>
-        <w:t>我實際讀到什麼</w:t>
-      </w:r>
-    </w:p>
-    <w:p>
-      <w:pPr>
-        <w:keepNext/>
-        <w:keepLines w:val="0"/>
-        <w:spacing w:before="0" w:after="40" w:line="293" w:lineRule="auto"/>
-      </w:pPr>
-      <w:r>
-        <w:rPr>
-          <w:rFonts w:ascii="Arial Unicode MS" w:hAnsi="Arial Unicode MS" w:eastAsia="Arial Unicode MS"/>
-          <w:b/>
-          <w:i w:val="0"/>
-          <w:color w:val="5B6573"/>
-          <w:sz w:val="22"/>
-        </w:rPr>
-        <w:t>測試讀者填寫</w:t>
-      </w:r>
-      <w:r>
-        <w:rPr>
-          <w:rFonts w:ascii="Arial Unicode MS" w:hAnsi="Arial Unicode MS" w:eastAsia="Arial Unicode MS"/>
-          <w:b w:val="0"/>
-          <w:i w:val="0"/>
-          <w:color w:val="7B8491"/>
-          <w:sz w:val="22"/>
-        </w:rPr>
-        <w:t xml:space="preserve">  ｜  </w:t>
-      </w:r>
       <w:r>
         <w:rPr>
           <w:rFonts w:ascii="Arial Unicode MS" w:hAnsi="Arial Unicode MS" w:eastAsia="Arial Unicode MS"/>
@@ -1106,24 +314,7 @@
           <w:color w:val="1A2340"/>
           <w:sz w:val="22"/>
         </w:rPr>
-        <w:t>至少留下 2 個具體內容；沒有聲音或感覺也可以照實寫。</w:t>
-      </w:r>
-    </w:p>
-    <w:p>
-      <w:pPr>
-        <w:keepNext w:val="0"/>
-        <w:keepLines w:val="0"/>
-        <w:spacing w:before="0" w:after="20" w:line="293" w:lineRule="auto"/>
-      </w:pPr>
-      <w:r>
-        <w:rPr>
-          <w:rFonts w:ascii="Arial Unicode MS" w:hAnsi="Arial Unicode MS" w:eastAsia="Arial Unicode MS"/>
-          <w:b/>
-          <w:i w:val="0"/>
-          <w:color w:val="1D4ED8"/>
-          <w:sz w:val="22"/>
-        </w:rPr>
-        <w:t>我看到｜人物、物件、位置或動作</w:t>
+        <w:t>我想讓人看見什麼？哪些可以稍後才知道？</w:t>
       </w:r>
     </w:p>
     <w:tbl>
@@ -1202,17 +393,369 @@
       <w:pPr>
         <w:keepNext w:val="0"/>
         <w:keepLines w:val="0"/>
-        <w:spacing w:before="0" w:after="20" w:line="293" w:lineRule="auto"/>
+        <w:spacing w:before="0" w:after="60" w:line="293" w:lineRule="auto"/>
+      </w:pPr>
+      <w:r>
+        <w:rPr>
+          <w:rFonts w:ascii="Arial Unicode MS" w:hAnsi="Arial Unicode MS" w:eastAsia="Arial Unicode MS"/>
+          <w:b w:val="0"/>
+          <w:i w:val="0"/>
+          <w:color w:val="1A2340"/>
+          <w:sz w:val="22"/>
+        </w:rPr>
+        <w:t>必要線索①＿＿＿＿＿＿＿＿＿　②＿＿＿＿＿＿＿＿＿</w:t>
+      </w:r>
+    </w:p>
+    <w:p>
+      <w:pPr>
+        <w:keepNext/>
+        <w:keepLines w:val="0"/>
+        <w:spacing w:before="100" w:after="100" w:line="293" w:lineRule="auto"/>
+      </w:pPr>
+      <w:r>
+        <w:rPr>
+          <w:rFonts w:ascii="JetBrains Mono" w:hAnsi="JetBrains Mono" w:eastAsia="Arial Unicode MS"/>
+          <w:b/>
+          <w:i w:val="0"/>
+          <w:color w:val="1D4ED8"/>
+          <w:sz w:val="30"/>
+        </w:rPr>
+        <w:t>03</w:t>
+      </w:r>
+      <w:r>
+        <w:rPr>
+          <w:rFonts w:ascii="Arial Unicode MS" w:hAnsi="Arial Unicode MS" w:eastAsia="Arial Unicode MS"/>
+          <w:b w:val="0"/>
+          <w:i w:val="0"/>
+          <w:color w:val="1D4ED8"/>
+          <w:sz w:val="30"/>
+        </w:rPr>
+        <w:t xml:space="preserve">  </w:t>
+      </w:r>
+      <w:r>
+        <w:rPr>
+          <w:rFonts w:ascii="Arial Unicode MS" w:hAnsi="Arial Unicode MS" w:eastAsia="Arial Unicode MS"/>
+          <w:b/>
+          <w:i w:val="0"/>
+          <w:color w:val="1A2340"/>
+          <w:sz w:val="30"/>
+        </w:rPr>
+        <w:t>先自己畫草圖，不使用 AI</w:t>
+      </w:r>
+    </w:p>
+    <w:p>
+      <w:pPr>
+        <w:keepNext w:val="0"/>
+        <w:keepLines w:val="0"/>
+        <w:spacing w:before="0" w:after="60" w:line="293" w:lineRule="auto"/>
+      </w:pPr>
+      <w:r>
+        <w:rPr>
+          <w:rFonts w:ascii="Arial Unicode MS" w:hAnsi="Arial Unicode MS" w:eastAsia="Arial Unicode MS"/>
+          <w:b w:val="0"/>
+          <w:i w:val="0"/>
+          <w:color w:val="1A2340"/>
+          <w:sz w:val="22"/>
+        </w:rPr>
+        <w:t>🔒 不使用 AI｜像老師示範：先選人與物，再畫位置、方向或動作。</w:t>
+      </w:r>
+    </w:p>
+    <w:tbl>
+      <w:tblPr>
+        <w:tblW w:type="dxa" w:w="9865"/>
+        <w:jc w:val="left"/>
+        <w:tblLayout w:type="fixed"/>
+        <w:tblLook w:firstColumn="1" w:firstRow="1" w:lastColumn="0" w:lastRow="0" w:noHBand="0" w:noVBand="1" w:val="04A0"/>
+        <w:tblInd w:type="dxa" w:w="0"/>
+      </w:tblPr>
+      <w:tblGrid>
+        <w:gridCol w:w="9865"/>
+      </w:tblGrid>
+      <w:tr>
+        <w:trPr>
+          <w:trHeight w:val="4252" w:hRule="atLeast"/>
+        </w:trPr>
+        <w:tc>
+          <w:tcPr>
+            <w:tcW w:type="dxa" w:w="9865"/>
+            <w:tcMar>
+              <w:top w:w="80" w:type="dxa"/>
+              <w:start w:w="100" w:type="dxa"/>
+              <w:bottom w:w="80" w:type="dxa"/>
+              <w:end w:w="100" w:type="dxa"/>
+            </w:tcMar>
+            <w:tcBorders>
+              <w:top w:val="single" w:sz="5" w:space="0" w:color="CBD5E1"/>
+              <w:bottom w:val="single" w:sz="5" w:space="0" w:color="CBD5E1"/>
+              <w:start w:val="single" w:sz="5" w:space="0" w:color="CBD5E1"/>
+              <w:end w:val="single" w:sz="5" w:space="0" w:color="CBD5E1"/>
+            </w:tcBorders>
+          </w:tcPr>
+          <w:p/>
+        </w:tc>
+      </w:tr>
+    </w:tbl>
+    <w:p>
+      <w:pPr>
+        <w:keepNext w:val="0"/>
+        <w:keepLines w:val="0"/>
+        <w:spacing w:before="0" w:after="0" w:line="293" w:lineRule="auto"/>
+      </w:pPr>
+      <w:r>
+        <w:rPr>
+          <w:rFonts w:ascii="Arial Unicode MS" w:hAnsi="Arial Unicode MS" w:eastAsia="Arial Unicode MS"/>
+          <w:b w:val="0"/>
+          <w:i w:val="0"/>
+          <w:color w:val="1A2340"/>
+          <w:sz w:val="22"/>
+        </w:rPr>
+        <w:t>對方會讀到這個重點嗎？把握＿＿％。這頁對讀者遮住；製作時可自己核對，不改原意與把握。72 分取得回報再攤開比較。</w:t>
+      </w:r>
+    </w:p>
+    <w:p>
+      <w:pPr>
+        <w:keepNext/>
+        <w:keepLines w:val="0"/>
+        <w:pageBreakBefore/>
+        <w:spacing w:before="0" w:after="60" w:line="293" w:lineRule="auto"/>
+      </w:pPr>
+      <w:r>
+        <w:rPr>
+          <w:rFonts w:ascii="JetBrains Mono" w:hAnsi="JetBrains Mono" w:eastAsia="Arial Unicode MS"/>
+          <w:b/>
+          <w:i w:val="0"/>
+          <w:color w:val="1D4ED8"/>
+          <w:sz w:val="22"/>
+        </w:rPr>
+        <w:t>W4 / 02</w:t>
+      </w:r>
+    </w:p>
+    <w:p>
+      <w:pPr>
+        <w:keepNext/>
+        <w:keepLines w:val="0"/>
+        <w:spacing w:before="0" w:after="80" w:line="252" w:lineRule="auto"/>
       </w:pPr>
       <w:r>
         <w:rPr>
           <w:rFonts w:ascii="Arial Unicode MS" w:hAnsi="Arial Unicode MS" w:eastAsia="Arial Unicode MS"/>
           <w:b/>
           <w:i w:val="0"/>
-          <w:color w:val="1D4ED8"/>
+          <w:color w:val="1A2340"/>
+          <w:sz w:val="44"/>
+        </w:rPr>
+        <w:t>給觀眾看的故事圖卡 V1</w:t>
+      </w:r>
+    </w:p>
+    <w:p>
+      <w:pPr>
+        <w:keepNext w:val="0"/>
+        <w:keepLines w:val="0"/>
+        <w:spacing w:before="0" w:after="140" w:line="293" w:lineRule="auto"/>
+      </w:pPr>
+      <w:r>
+        <w:rPr>
+          <w:rFonts w:ascii="Arial Unicode MS" w:hAnsi="Arial Unicode MS" w:eastAsia="Arial Unicode MS"/>
+          <w:b w:val="0"/>
+          <w:i w:val="0"/>
+          <w:color w:val="5B6573"/>
           <w:sz w:val="22"/>
         </w:rPr>
-        <w:t>我聽到｜聲音或語氣；沒有就寫「沒聽到」</w:t>
+        <w:t>作品先自己工作；作者檢查與原意先遮住。</w:t>
+      </w:r>
+    </w:p>
+    <w:p>
+      <w:pPr>
+        <w:keepNext/>
+        <w:keepLines w:val="0"/>
+        <w:spacing w:before="60" w:after="100" w:line="293" w:lineRule="auto"/>
+      </w:pPr>
+      <w:r>
+        <w:rPr>
+          <w:rFonts w:ascii="JetBrains Mono" w:hAnsi="JetBrains Mono" w:eastAsia="Arial Unicode MS"/>
+          <w:b/>
+          <w:i w:val="0"/>
+          <w:color w:val="1D4ED8"/>
+          <w:sz w:val="30"/>
+        </w:rPr>
+        <w:t>04</w:t>
+      </w:r>
+      <w:r>
+        <w:rPr>
+          <w:rFonts w:ascii="Arial Unicode MS" w:hAnsi="Arial Unicode MS" w:eastAsia="Arial Unicode MS"/>
+          <w:b w:val="0"/>
+          <w:i w:val="0"/>
+          <w:color w:val="1D4ED8"/>
+          <w:sz w:val="30"/>
+        </w:rPr>
+        <w:t xml:space="preserve">  </w:t>
+      </w:r>
+      <w:r>
+        <w:rPr>
+          <w:rFonts w:ascii="Arial Unicode MS" w:hAnsi="Arial Unicode MS" w:eastAsia="Arial Unicode MS"/>
+          <w:b/>
+          <w:i w:val="0"/>
+          <w:color w:val="1A2340"/>
+          <w:sz w:val="30"/>
+        </w:rPr>
+        <w:t>一張主要畫面，必要時用三格</w:t>
+      </w:r>
+    </w:p>
+    <w:p>
+      <w:pPr>
+        <w:keepNext w:val="0"/>
+        <w:keepLines w:val="0"/>
+        <w:spacing w:before="0" w:after="60" w:line="293" w:lineRule="auto"/>
+      </w:pPr>
+      <w:r>
+        <w:rPr>
+          <w:rFonts w:ascii="Arial Unicode MS" w:hAnsi="Arial Unicode MS" w:eastAsia="Arial Unicode MS"/>
+          <w:b w:val="0"/>
+          <w:i w:val="0"/>
+          <w:color w:val="1A2340"/>
+          <w:sz w:val="22"/>
+        </w:rPr>
+        <w:t>🧭 可選用 AI｜□ 手繪　□ AI 生圖　□ 混合。必要的字可以放。</w:t>
+      </w:r>
+    </w:p>
+    <w:p>
+      <w:pPr>
+        <w:keepNext w:val="0"/>
+        <w:keepLines w:val="0"/>
+        <w:spacing w:before="0" w:after="60" w:line="293" w:lineRule="auto"/>
+      </w:pPr>
+      <w:r>
+        <w:rPr>
+          <w:rFonts w:ascii="Arial Unicode MS" w:hAnsi="Arial Unicode MS" w:eastAsia="Arial Unicode MS"/>
+          <w:b w:val="0"/>
+          <w:i w:val="0"/>
+          <w:color w:val="1A2340"/>
+          <w:sz w:val="22"/>
+        </w:rPr>
+        <w:t>紙本：畫在下框。數位：填檔名，圖框可留白，不必重畫。</w:t>
+      </w:r>
+    </w:p>
+    <w:p>
+      <w:pPr>
+        <w:keepNext w:val="0"/>
+        <w:keepLines w:val="0"/>
+        <w:spacing w:before="0" w:after="60" w:line="293" w:lineRule="auto"/>
+      </w:pPr>
+      <w:r>
+        <w:rPr>
+          <w:rFonts w:ascii="Arial Unicode MS" w:hAnsi="Arial Unicode MS" w:eastAsia="Arial Unicode MS"/>
+          <w:b w:val="0"/>
+          <w:i w:val="0"/>
+          <w:color w:val="1A2340"/>
+          <w:sz w:val="22"/>
+        </w:rPr>
+        <w:t>數位 V1 檔名：座號_W4_V1＿＿＿＿　□ 已保存測讀前版本</w:t>
+      </w:r>
+    </w:p>
+    <w:tbl>
+      <w:tblPr>
+        <w:tblW w:type="dxa" w:w="9865"/>
+        <w:jc w:val="left"/>
+        <w:tblLayout w:type="fixed"/>
+        <w:tblLook w:firstColumn="1" w:firstRow="1" w:lastColumn="0" w:lastRow="0" w:noHBand="0" w:noVBand="1" w:val="04A0"/>
+        <w:tblInd w:type="dxa" w:w="0"/>
+      </w:tblPr>
+      <w:tblGrid>
+        <w:gridCol w:w="9865"/>
+      </w:tblGrid>
+      <w:tr>
+        <w:trPr>
+          <w:trHeight w:val="6293" w:hRule="atLeast"/>
+        </w:trPr>
+        <w:tc>
+          <w:tcPr>
+            <w:tcW w:type="dxa" w:w="9865"/>
+            <w:tcMar>
+              <w:top w:w="80" w:type="dxa"/>
+              <w:start w:w="100" w:type="dxa"/>
+              <w:bottom w:w="80" w:type="dxa"/>
+              <w:end w:w="100" w:type="dxa"/>
+            </w:tcMar>
+            <w:tcBorders>
+              <w:top w:val="single" w:sz="5" w:space="0" w:color="CBD5E1"/>
+              <w:bottom w:val="single" w:sz="5" w:space="0" w:color="CBD5E1"/>
+              <w:start w:val="single" w:sz="5" w:space="0" w:color="CBD5E1"/>
+              <w:end w:val="single" w:sz="5" w:space="0" w:color="CBD5E1"/>
+            </w:tcBorders>
+          </w:tcPr>
+          <w:p/>
+        </w:tc>
+      </w:tr>
+    </w:tbl>
+    <w:p>
+      <w:pPr>
+        <w:keepNext w:val="0"/>
+        <w:keepLines w:val="0"/>
+        <w:spacing w:before="0" w:after="60" w:line="293" w:lineRule="auto"/>
+      </w:pPr>
+      <w:r>
+        <w:rPr>
+          <w:rFonts w:ascii="Arial Unicode MS" w:hAnsi="Arial Unicode MS" w:eastAsia="Arial Unicode MS"/>
+          <w:b/>
+          <w:i w:val="0"/>
+          <w:color w:val="1A2340"/>
+          <w:sz w:val="22"/>
+        </w:rPr>
+        <w:t>↑ 只有這個圖框，或數位 V1 全螢幕，給讀者看。</w:t>
+      </w:r>
+    </w:p>
+    <w:p>
+      <w:pPr>
+        <w:keepNext/>
+        <w:keepLines w:val="0"/>
+        <w:spacing w:before="120" w:after="100" w:line="293" w:lineRule="auto"/>
+      </w:pPr>
+      <w:r>
+        <w:rPr>
+          <w:rFonts w:ascii="JetBrains Mono" w:hAnsi="JetBrains Mono" w:eastAsia="Arial Unicode MS"/>
+          <w:b/>
+          <w:i w:val="0"/>
+          <w:color w:val="1D4ED8"/>
+          <w:sz w:val="30"/>
+        </w:rPr>
+        <w:t>05</w:t>
+      </w:r>
+      <w:r>
+        <w:rPr>
+          <w:rFonts w:ascii="Arial Unicode MS" w:hAnsi="Arial Unicode MS" w:eastAsia="Arial Unicode MS"/>
+          <w:b w:val="0"/>
+          <w:i w:val="0"/>
+          <w:color w:val="1D4ED8"/>
+          <w:sz w:val="30"/>
+        </w:rPr>
+        <w:t xml:space="preserve">  </w:t>
+      </w:r>
+      <w:r>
+        <w:rPr>
+          <w:rFonts w:ascii="Arial Unicode MS" w:hAnsi="Arial Unicode MS" w:eastAsia="Arial Unicode MS"/>
+          <w:b/>
+          <w:i w:val="0"/>
+          <w:color w:val="1A2340"/>
+          <w:sz w:val="30"/>
+        </w:rPr>
+        <w:t>作者先查，填完遮住這一區</w:t>
+      </w:r>
+    </w:p>
+    <w:p>
+      <w:pPr>
+        <w:keepNext w:val="0"/>
+        <w:keepLines w:val="0"/>
+        <w:spacing w:before="0" w:after="60" w:line="293" w:lineRule="auto"/>
+      </w:pPr>
+      <w:r>
+        <w:rPr>
+          <w:rFonts w:ascii="Arial Unicode MS" w:hAnsi="Arial Unicode MS" w:eastAsia="Arial Unicode MS"/>
+          <w:b w:val="0"/>
+          <w:i w:val="0"/>
+          <w:color w:val="1A2340"/>
+          <w:sz w:val="22"/>
+        </w:rPr>
+        <w:t>兩個必要線索有出現嗎？我核對／調整的一處是：</w:t>
       </w:r>
     </w:p>
     <w:tbl>
@@ -1291,304 +834,36 @@
       <w:pPr>
         <w:keepNext w:val="0"/>
         <w:keepLines w:val="0"/>
-        <w:spacing w:before="0" w:after="20" w:line="293" w:lineRule="auto"/>
+        <w:spacing w:before="0" w:after="60" w:line="293" w:lineRule="auto"/>
+      </w:pPr>
+      <w:r>
+        <w:rPr>
+          <w:rFonts w:ascii="Arial Unicode MS" w:hAnsi="Arial Unicode MS" w:eastAsia="Arial Unicode MS"/>
+          <w:b w:val="0"/>
+          <w:i w:val="0"/>
+          <w:color w:val="1A2340"/>
+          <w:sz w:val="22"/>
+        </w:rPr>
+        <w:t>提示取自 02–03：場景人物＋兩個線索＋位置動作，不必抄提示。AI 最多一次生成、一次局部調整；44 分沒可用圖就手繪。只修影響意思處，畫風可先保留。用代稱，不上傳真人照片。</w:t>
+      </w:r>
+    </w:p>
+    <w:p>
+      <w:pPr>
+        <w:keepNext w:val="0"/>
+        <w:keepLines w:val="0"/>
+        <w:spacing w:before="0" w:after="0" w:line="293" w:lineRule="auto"/>
       </w:pPr>
       <w:r>
         <w:rPr>
           <w:rFonts w:ascii="Arial Unicode MS" w:hAnsi="Arial Unicode MS" w:eastAsia="Arial Unicode MS"/>
           <w:b/>
           <w:i w:val="0"/>
-          <w:color w:val="1D4ED8"/>
+          <w:color w:val="1A2340"/>
           <w:sz w:val="22"/>
         </w:rPr>
-        <w:t>我感覺到｜氣氛或情緒；指出是哪幾個字帶來的</w:t>
+        <w:t>測讀前保存 V1；測讀時不改、不補背景、不給提示詞。</w:t>
       </w:r>
     </w:p>
-    <w:tbl>
-      <w:tblPr>
-        <w:tblW w:type="dxa" w:w="9865"/>
-        <w:jc w:val="left"/>
-        <w:tblLayout w:type="fixed"/>
-        <w:tblLook w:firstColumn="1" w:firstRow="1" w:lastColumn="0" w:lastRow="0" w:noHBand="0" w:noVBand="1" w:val="04A0"/>
-        <w:tblInd w:type="dxa" w:w="0"/>
-      </w:tblPr>
-      <w:tblGrid>
-        <w:gridCol w:w="9865"/>
-      </w:tblGrid>
-      <w:tr>
-        <w:trPr>
-          <w:trHeight w:val="510" w:hRule="atLeast"/>
-        </w:trPr>
-        <w:tc>
-          <w:tcPr>
-            <w:tcW w:type="dxa" w:w="9865"/>
-            <w:tcMar>
-              <w:top w:w="0" w:type="dxa"/>
-              <w:start w:w="0" w:type="dxa"/>
-              <w:bottom w:w="0" w:type="dxa"/>
-              <w:end w:w="0" w:type="dxa"/>
-            </w:tcMar>
-            <w:tcBorders>
-              <w:top w:val="nil"/>
-              <w:bottom w:val="single" w:sz="5" w:space="0" w:color="CBD5E1"/>
-              <w:start w:val="nil"/>
-              <w:end w:val="nil"/>
-            </w:tcBorders>
-          </w:tcPr>
-          <w:p>
-            <w:pPr>
-              <w:spacing w:before="0" w:after="0" w:line="240" w:lineRule="auto"/>
-            </w:pPr>
-            <w:r>
-              <w:t xml:space="preserve"> </w:t>
-            </w:r>
-          </w:p>
-        </w:tc>
-      </w:tr>
-      <w:tr>
-        <w:trPr>
-          <w:trHeight w:val="510" w:hRule="atLeast"/>
-        </w:trPr>
-        <w:tc>
-          <w:tcPr>
-            <w:tcW w:type="dxa" w:w="9865"/>
-            <w:tcMar>
-              <w:top w:w="0" w:type="dxa"/>
-              <w:start w:w="0" w:type="dxa"/>
-              <w:bottom w:w="0" w:type="dxa"/>
-              <w:end w:w="0" w:type="dxa"/>
-            </w:tcMar>
-            <w:tcBorders>
-              <w:top w:val="nil"/>
-              <w:bottom w:val="single" w:sz="5" w:space="0" w:color="CBD5E1"/>
-              <w:start w:val="nil"/>
-              <w:end w:val="nil"/>
-            </w:tcBorders>
-          </w:tcPr>
-          <w:p>
-            <w:pPr>
-              <w:spacing w:before="0" w:after="20" w:line="240" w:lineRule="auto"/>
-            </w:pPr>
-            <w:r>
-              <w:t xml:space="preserve"> </w:t>
-            </w:r>
-          </w:p>
-        </w:tc>
-      </w:tr>
-    </w:tbl>
-    <w:p>
-      <w:pPr>
-        <w:keepNext w:val="0"/>
-        <w:keepLines w:val="0"/>
-        <w:spacing w:before="0" w:after="20" w:line="293" w:lineRule="auto"/>
-      </w:pPr>
-      <w:r>
-        <w:rPr>
-          <w:rFonts w:ascii="Arial Unicode MS" w:hAnsi="Arial Unicode MS" w:eastAsia="Arial Unicode MS"/>
-          <w:b/>
-          <w:i w:val="0"/>
-          <w:color w:val="1D4ED8"/>
-          <w:sz w:val="22"/>
-        </w:rPr>
-        <w:t>我以為是｜先讀成什麼，後來才發現什麼</w:t>
-      </w:r>
-    </w:p>
-    <w:tbl>
-      <w:tblPr>
-        <w:tblW w:type="dxa" w:w="9865"/>
-        <w:jc w:val="left"/>
-        <w:tblLayout w:type="fixed"/>
-        <w:tblLook w:firstColumn="1" w:firstRow="1" w:lastColumn="0" w:lastRow="0" w:noHBand="0" w:noVBand="1" w:val="04A0"/>
-        <w:tblInd w:type="dxa" w:w="0"/>
-      </w:tblPr>
-      <w:tblGrid>
-        <w:gridCol w:w="9865"/>
-      </w:tblGrid>
-      <w:tr>
-        <w:trPr>
-          <w:trHeight w:val="510" w:hRule="atLeast"/>
-        </w:trPr>
-        <w:tc>
-          <w:tcPr>
-            <w:tcW w:type="dxa" w:w="9865"/>
-            <w:tcMar>
-              <w:top w:w="0" w:type="dxa"/>
-              <w:start w:w="0" w:type="dxa"/>
-              <w:bottom w:w="0" w:type="dxa"/>
-              <w:end w:w="0" w:type="dxa"/>
-            </w:tcMar>
-            <w:tcBorders>
-              <w:top w:val="nil"/>
-              <w:bottom w:val="single" w:sz="5" w:space="0" w:color="CBD5E1"/>
-              <w:start w:val="nil"/>
-              <w:end w:val="nil"/>
-            </w:tcBorders>
-          </w:tcPr>
-          <w:p>
-            <w:pPr>
-              <w:spacing w:before="0" w:after="0" w:line="240" w:lineRule="auto"/>
-            </w:pPr>
-            <w:r>
-              <w:t xml:space="preserve"> </w:t>
-            </w:r>
-          </w:p>
-        </w:tc>
-      </w:tr>
-      <w:tr>
-        <w:trPr>
-          <w:trHeight w:val="510" w:hRule="atLeast"/>
-        </w:trPr>
-        <w:tc>
-          <w:tcPr>
-            <w:tcW w:type="dxa" w:w="9865"/>
-            <w:tcMar>
-              <w:top w:w="0" w:type="dxa"/>
-              <w:start w:w="0" w:type="dxa"/>
-              <w:bottom w:w="0" w:type="dxa"/>
-              <w:end w:w="0" w:type="dxa"/>
-            </w:tcMar>
-            <w:tcBorders>
-              <w:top w:val="nil"/>
-              <w:bottom w:val="single" w:sz="5" w:space="0" w:color="CBD5E1"/>
-              <w:start w:val="nil"/>
-              <w:end w:val="nil"/>
-            </w:tcBorders>
-          </w:tcPr>
-          <w:p>
-            <w:pPr>
-              <w:spacing w:before="0" w:after="20" w:line="240" w:lineRule="auto"/>
-            </w:pPr>
-            <w:r>
-              <w:t xml:space="preserve"> </w:t>
-            </w:r>
-          </w:p>
-        </w:tc>
-      </w:tr>
-    </w:tbl>
-    <w:p>
-      <w:pPr>
-        <w:keepNext/>
-        <w:keepLines w:val="0"/>
-        <w:spacing w:before="100" w:after="100" w:line="293" w:lineRule="auto"/>
-      </w:pPr>
-      <w:r>
-        <w:rPr>
-          <w:rFonts w:ascii="JetBrains Mono" w:hAnsi="JetBrains Mono" w:eastAsia="Arial Unicode MS"/>
-          <w:b/>
-          <w:i w:val="0"/>
-          <w:color w:val="1D4ED8"/>
-          <w:sz w:val="30"/>
-        </w:rPr>
-        <w:t>07</w:t>
-      </w:r>
-      <w:r>
-        <w:rPr>
-          <w:rFonts w:ascii="Arial Unicode MS" w:hAnsi="Arial Unicode MS" w:eastAsia="Arial Unicode MS"/>
-          <w:b w:val="0"/>
-          <w:i w:val="0"/>
-          <w:color w:val="1D4ED8"/>
-          <w:sz w:val="30"/>
-        </w:rPr>
-        <w:t xml:space="preserve">  </w:t>
-      </w:r>
-      <w:r>
-        <w:rPr>
-          <w:rFonts w:ascii="Arial Unicode MS" w:hAnsi="Arial Unicode MS" w:eastAsia="Arial Unicode MS"/>
-          <w:b/>
-          <w:i w:val="0"/>
-          <w:color w:val="1A2340"/>
-          <w:sz w:val="30"/>
-        </w:rPr>
-        <w:t>描述，不評分</w:t>
-      </w:r>
-    </w:p>
-    <w:tbl>
-      <w:tblPr>
-        <w:tblW w:type="dxa" w:w="9865"/>
-        <w:jc w:val="left"/>
-        <w:tblLayout w:type="fixed"/>
-        <w:tblLook w:firstColumn="1" w:firstRow="1" w:lastColumn="0" w:lastRow="0" w:noHBand="0" w:noVBand="1" w:val="04A0"/>
-        <w:tblInd w:type="dxa" w:w="0"/>
-      </w:tblPr>
-      <w:tblGrid>
-        <w:gridCol w:w="9865"/>
-      </w:tblGrid>
-      <w:tr>
-        <w:tc>
-          <w:tcPr>
-            <w:tcW w:type="dxa" w:w="9865"/>
-            <w:tcMar>
-              <w:top w:w="100" w:type="dxa"/>
-              <w:start w:w="150" w:type="dxa"/>
-              <w:bottom w:w="100" w:type="dxa"/>
-              <w:end w:w="150" w:type="dxa"/>
-            </w:tcMar>
-            <w:tcBorders>
-              <w:top w:val="nil"/>
-              <w:bottom w:val="nil"/>
-              <w:start w:val="single" w:sz="14" w:space="0" w:color="1D4ED8"/>
-              <w:end w:val="nil"/>
-            </w:tcBorders>
-            <w:shd w:val="clear" w:color="auto" w:fill="F5F7FA"/>
-            <w:vAlign w:val="center"/>
-          </w:tcPr>
-          <w:p>
-            <w:pPr>
-              <w:keepNext w:val="0"/>
-              <w:keepLines w:val="0"/>
-              <w:spacing w:before="0" w:after="80" w:line="293" w:lineRule="auto"/>
-            </w:pPr>
-            <w:r>
-              <w:rPr>
-                <w:rFonts w:ascii="Arial Unicode MS" w:hAnsi="Arial Unicode MS" w:eastAsia="Arial Unicode MS"/>
-                <w:b/>
-                <w:i w:val="0"/>
-                <w:color w:val="C2414D"/>
-                <w:sz w:val="22"/>
-              </w:rPr>
-              <w:t>先不要</w:t>
-            </w:r>
-            <w:r>
-              <w:rPr>
-                <w:rFonts w:ascii="Arial Unicode MS" w:hAnsi="Arial Unicode MS" w:eastAsia="Arial Unicode MS"/>
-                <w:b w:val="0"/>
-                <w:i w:val="0"/>
-                <w:color w:val="1A2340"/>
-                <w:sz w:val="22"/>
-              </w:rPr>
-              <w:t xml:space="preserve">　「寫得很好」「很有畫面」「可以再多一點」。</w:t>
-            </w:r>
-          </w:p>
-          <w:p>
-            <w:pPr>
-              <w:keepNext w:val="0"/>
-              <w:keepLines w:val="0"/>
-              <w:spacing w:before="0" w:after="0" w:line="293" w:lineRule="auto"/>
-            </w:pPr>
-            <w:r>
-              <w:rPr>
-                <w:rFonts w:ascii="Arial Unicode MS" w:hAnsi="Arial Unicode MS" w:eastAsia="Arial Unicode MS"/>
-                <w:b/>
-                <w:i w:val="0"/>
-                <w:color w:val="1D4ED8"/>
-                <w:sz w:val="22"/>
-              </w:rPr>
-              <w:t>改成</w:t>
-            </w:r>
-            <w:r>
-              <w:rPr>
-                <w:rFonts w:ascii="Arial Unicode MS" w:hAnsi="Arial Unicode MS" w:eastAsia="Arial Unicode MS"/>
-                <w:b w:val="0"/>
-                <w:i w:val="0"/>
-                <w:color w:val="1A2340"/>
-                <w:sz w:val="22"/>
-              </w:rPr>
-              <w:t xml:space="preserve">　「我看到紙團落在路樹下」「我沒看出人物為什麼停住」。</w:t>
-            </w:r>
-          </w:p>
-        </w:tc>
-      </w:tr>
-    </w:tbl>
     <w:p>
       <w:pPr>
         <w:keepNext/>
@@ -1621,7 +896,7 @@
           <w:color w:val="1A2340"/>
           <w:sz w:val="44"/>
         </w:rPr>
-        <w:t>找出落差，再做最後決定</w:t>
+        <w:t>真人回報與我的決定</w:t>
       </w:r>
     </w:p>
     <w:p>
@@ -1638,14 +913,14 @@
           <w:color w:val="5B6573"/>
           <w:sz w:val="22"/>
         </w:rPr>
-        <w:t>回饋提供證據；怎麼改，仍然由作者決定。</w:t>
+        <w:t>試看者未參與構圖、不知原意；只交換這張，不翻面、不拍照。</w:t>
       </w:r>
     </w:p>
     <w:p>
       <w:pPr>
         <w:keepNext/>
         <w:keepLines w:val="0"/>
-        <w:spacing w:before="40" w:after="100" w:line="293" w:lineRule="auto"/>
+        <w:spacing w:before="60" w:after="100" w:line="293" w:lineRule="auto"/>
       </w:pPr>
       <w:r>
         <w:rPr>
@@ -1655,7 +930,7 @@
           <w:color w:val="1D4ED8"/>
           <w:sz w:val="30"/>
         </w:rPr>
-        <w:t>08</w:t>
+        <w:t>06</w:t>
       </w:r>
       <w:r>
         <w:rPr>
@@ -1675,198 +950,7 @@
           <w:color w:val="1A2340"/>
           <w:sz w:val="30"/>
         </w:rPr>
-        <w:t>先打開原意，把兩邊放在一起看</w:t>
-      </w:r>
-    </w:p>
-    <w:tbl>
-      <w:tblPr>
-        <w:tblW w:type="dxa" w:w="9865"/>
-        <w:jc w:val="left"/>
-        <w:tblLayout w:type="fixed"/>
-        <w:tblLook w:firstColumn="1" w:firstRow="1" w:lastColumn="0" w:lastRow="0" w:noHBand="0" w:noVBand="1" w:val="04A0"/>
-        <w:tblInd w:type="dxa" w:w="0"/>
-      </w:tblPr>
-      <w:tblGrid>
-        <w:gridCol w:w="4932"/>
-        <w:gridCol w:w="4933"/>
-      </w:tblGrid>
-      <w:tr>
-        <w:tc>
-          <w:tcPr>
-            <w:tcW w:type="dxa" w:w="4932"/>
-            <w:tcMar>
-              <w:top w:w="60" w:type="dxa"/>
-              <w:start w:w="100" w:type="dxa"/>
-              <w:bottom w:w="60" w:type="dxa"/>
-              <w:end w:w="100" w:type="dxa"/>
-            </w:tcMar>
-            <w:shd w:val="clear" w:color="auto" w:fill="F5F7FA"/>
-            <w:tcBorders>
-              <w:top w:val="nil"/>
-              <w:bottom w:val="single" w:sz="7" w:space="0" w:color="CBD5E1"/>
-              <w:start w:val="nil"/>
-              <w:end w:val="single" w:sz="4" w:space="0" w:color="CBD5E1"/>
-            </w:tcBorders>
-          </w:tcPr>
-          <w:p>
-            <w:pPr>
-              <w:spacing w:before="0" w:after="0"/>
-            </w:pPr>
-            <w:r>
-              <w:rPr>
-                <w:rFonts w:ascii="Arial Unicode MS" w:hAnsi="Arial Unicode MS" w:eastAsia="Arial Unicode MS"/>
-                <w:b/>
-                <w:i w:val="0"/>
-                <w:color w:val="1A2340"/>
-                <w:sz w:val="22"/>
-              </w:rPr>
-              <w:t>第一頁封存原意</w:t>
-            </w:r>
-          </w:p>
-        </w:tc>
-        <w:tc>
-          <w:tcPr>
-            <w:tcW w:type="dxa" w:w="4933"/>
-            <w:tcMar>
-              <w:top w:w="60" w:type="dxa"/>
-              <w:start w:w="100" w:type="dxa"/>
-              <w:bottom w:w="60" w:type="dxa"/>
-              <w:end w:w="100" w:type="dxa"/>
-            </w:tcMar>
-            <w:shd w:val="clear" w:color="auto" w:fill="F5F7FA"/>
-            <w:tcBorders>
-              <w:top w:val="nil"/>
-              <w:bottom w:val="single" w:sz="7" w:space="0" w:color="CBD5E1"/>
-              <w:start w:val="nil"/>
-              <w:end w:val="single" w:sz="4" w:space="0" w:color="CBD5E1"/>
-            </w:tcBorders>
-          </w:tcPr>
-          <w:p>
-            <w:pPr>
-              <w:spacing w:before="0" w:after="0"/>
-            </w:pPr>
-            <w:r>
-              <w:rPr>
-                <w:rFonts w:ascii="Arial Unicode MS" w:hAnsi="Arial Unicode MS" w:eastAsia="Arial Unicode MS"/>
-                <w:b/>
-                <w:i w:val="0"/>
-                <w:color w:val="1A2340"/>
-                <w:sz w:val="22"/>
-              </w:rPr>
-              <w:t>讀者實際讀到</w:t>
-            </w:r>
-          </w:p>
-        </w:tc>
-      </w:tr>
-      <w:tr>
-        <w:trPr>
-          <w:trHeight w:val="1361" w:hRule="atLeast"/>
-        </w:trPr>
-        <w:tc>
-          <w:tcPr>
-            <w:tcW w:type="dxa" w:w="4932"/>
-            <w:tcMar>
-              <w:top w:w="70" w:type="dxa"/>
-              <w:start w:w="100" w:type="dxa"/>
-              <w:bottom w:w="70" w:type="dxa"/>
-              <w:end w:w="100" w:type="dxa"/>
-            </w:tcMar>
-            <w:tcBorders>
-              <w:top w:val="nil"/>
-              <w:bottom w:val="single" w:sz="5" w:space="0" w:color="CBD5E1"/>
-              <w:start w:val="nil"/>
-              <w:end w:val="single" w:sz="4" w:space="0" w:color="CBD5E1"/>
-            </w:tcBorders>
-          </w:tcPr>
-          <w:p>
-            <w:pPr>
-              <w:spacing w:before="0" w:after="0"/>
-            </w:pPr>
-            <w:r>
-              <w:rPr>
-                <w:rFonts w:ascii="JetBrains Mono" w:hAnsi="JetBrains Mono" w:eastAsia="Arial Unicode MS"/>
-                <w:b w:val="0"/>
-                <w:i w:val="0"/>
-                <w:color w:val="1A2340"/>
-                <w:sz w:val="22"/>
-              </w:rPr>
-              <w:t>________________________________</w:t>
-              <w:br/>
-              <w:t>________________________________</w:t>
-            </w:r>
-          </w:p>
-        </w:tc>
-        <w:tc>
-          <w:tcPr>
-            <w:tcW w:type="dxa" w:w="4933"/>
-            <w:tcMar>
-              <w:top w:w="70" w:type="dxa"/>
-              <w:start w:w="100" w:type="dxa"/>
-              <w:bottom w:w="70" w:type="dxa"/>
-              <w:end w:w="100" w:type="dxa"/>
-            </w:tcMar>
-            <w:tcBorders>
-              <w:top w:val="nil"/>
-              <w:bottom w:val="single" w:sz="5" w:space="0" w:color="CBD5E1"/>
-              <w:start w:val="nil"/>
-              <w:end w:val="single" w:sz="4" w:space="0" w:color="CBD5E1"/>
-            </w:tcBorders>
-          </w:tcPr>
-          <w:p>
-            <w:pPr>
-              <w:spacing w:before="0" w:after="0"/>
-            </w:pPr>
-            <w:r>
-              <w:rPr>
-                <w:rFonts w:ascii="JetBrains Mono" w:hAnsi="JetBrains Mono" w:eastAsia="Arial Unicode MS"/>
-                <w:b w:val="0"/>
-                <w:i w:val="0"/>
-                <w:color w:val="1A2340"/>
-                <w:sz w:val="22"/>
-              </w:rPr>
-              <w:t>________________________________</w:t>
-              <w:br/>
-              <w:t>________________________________</w:t>
-            </w:r>
-          </w:p>
-        </w:tc>
-      </w:tr>
-    </w:tbl>
-    <w:p>
-      <w:pPr>
-        <w:keepNext/>
-        <w:keepLines w:val="0"/>
-        <w:spacing w:before="120" w:after="100" w:line="293" w:lineRule="auto"/>
-      </w:pPr>
-      <w:r>
-        <w:rPr>
-          <w:rFonts w:ascii="JetBrains Mono" w:hAnsi="JetBrains Mono" w:eastAsia="Arial Unicode MS"/>
-          <w:b/>
-          <w:i w:val="0"/>
-          <w:color w:val="1D4ED8"/>
-          <w:sz w:val="30"/>
-        </w:rPr>
-        <w:t>09</w:t>
-      </w:r>
-      <w:r>
-        <w:rPr>
-          <w:rFonts w:ascii="Arial Unicode MS" w:hAnsi="Arial Unicode MS" w:eastAsia="Arial Unicode MS"/>
-          <w:b w:val="0"/>
-          <w:i w:val="0"/>
-          <w:color w:val="1D4ED8"/>
-          <w:sz w:val="30"/>
-        </w:rPr>
-        <w:t xml:space="preserve">  </w:t>
-      </w:r>
-      <w:r>
-        <w:rPr>
-          <w:rFonts w:ascii="Arial Unicode MS" w:hAnsi="Arial Unicode MS" w:eastAsia="Arial Unicode MS"/>
-          <w:b/>
-          <w:i w:val="0"/>
-          <w:color w:val="1A2340"/>
-          <w:sz w:val="30"/>
-        </w:rPr>
-        <w:t>再做 1–2 個決定</w:t>
+        <w:t>讀者填：我實際收到什麼</w:t>
       </w:r>
     </w:p>
     <w:p>
@@ -1878,413 +962,19 @@
       <w:r>
         <w:rPr>
           <w:rFonts w:ascii="Arial Unicode MS" w:hAnsi="Arial Unicode MS" w:eastAsia="Arial Unicode MS"/>
-          <w:b/>
-          <w:i w:val="0"/>
-          <w:color w:val="1A2340"/>
-          <w:sz w:val="22"/>
-        </w:rPr>
-        <w:t>□ 補一個位置　　□ 寫清楚一個動作　　□ 補上前後變化　　□ 我決定不改</w:t>
-      </w:r>
-    </w:p>
-    <w:p>
-      <w:pPr>
-        <w:keepNext/>
-        <w:keepLines w:val="0"/>
-        <w:spacing w:before="20" w:after="20" w:line="293" w:lineRule="auto"/>
-      </w:pPr>
-      <w:r>
-        <w:rPr>
-          <w:rFonts w:ascii="Arial Unicode MS" w:hAnsi="Arial Unicode MS" w:eastAsia="Arial Unicode MS"/>
-          <w:b/>
-          <w:i w:val="0"/>
-          <w:color w:val="5B6573"/>
-          <w:sz w:val="22"/>
-        </w:rPr>
-        <w:t>先找依據</w:t>
-      </w:r>
-      <w:r>
-        <w:rPr>
-          <w:rFonts w:ascii="Arial Unicode MS" w:hAnsi="Arial Unicode MS" w:eastAsia="Arial Unicode MS"/>
-          <w:b w:val="0"/>
-          <w:i w:val="0"/>
-          <w:color w:val="7B8491"/>
-          <w:sz w:val="22"/>
-        </w:rPr>
-        <w:t xml:space="preserve">  ｜  </w:t>
-      </w:r>
-      <w:r>
-        <w:rPr>
-          <w:rFonts w:ascii="Arial Unicode MS" w:hAnsi="Arial Unicode MS" w:eastAsia="Arial Unicode MS"/>
           <w:b w:val="0"/>
           <w:i w:val="0"/>
           <w:color w:val="1A2340"/>
           <w:sz w:val="22"/>
         </w:rPr>
-        <w:t>我的決定要處理的是：</w:t>
-      </w:r>
-    </w:p>
-    <w:tbl>
-      <w:tblPr>
-        <w:tblW w:type="dxa" w:w="9865"/>
-        <w:jc w:val="left"/>
-        <w:tblLayout w:type="fixed"/>
-        <w:tblLook w:firstColumn="1" w:firstRow="1" w:lastColumn="0" w:lastRow="0" w:noHBand="0" w:noVBand="1" w:val="04A0"/>
-        <w:tblInd w:type="dxa" w:w="0"/>
-      </w:tblPr>
-      <w:tblGrid>
-        <w:gridCol w:w="9865"/>
-      </w:tblGrid>
-      <w:tr>
-        <w:trPr>
-          <w:trHeight w:val="510" w:hRule="atLeast"/>
-        </w:trPr>
-        <w:tc>
-          <w:tcPr>
-            <w:tcW w:type="dxa" w:w="9865"/>
-            <w:tcMar>
-              <w:top w:w="0" w:type="dxa"/>
-              <w:start w:w="0" w:type="dxa"/>
-              <w:bottom w:w="0" w:type="dxa"/>
-              <w:end w:w="0" w:type="dxa"/>
-            </w:tcMar>
-            <w:tcBorders>
-              <w:top w:val="nil"/>
-              <w:bottom w:val="single" w:sz="5" w:space="0" w:color="CBD5E1"/>
-              <w:start w:val="nil"/>
-              <w:end w:val="nil"/>
-            </w:tcBorders>
-          </w:tcPr>
-          <w:p>
-            <w:pPr>
-              <w:spacing w:before="0" w:after="0" w:line="240" w:lineRule="auto"/>
-            </w:pPr>
-            <w:r>
-              <w:t xml:space="preserve"> </w:t>
-            </w:r>
-          </w:p>
-        </w:tc>
-      </w:tr>
-      <w:tr>
-        <w:trPr>
-          <w:trHeight w:val="510" w:hRule="atLeast"/>
-        </w:trPr>
-        <w:tc>
-          <w:tcPr>
-            <w:tcW w:type="dxa" w:w="9865"/>
-            <w:tcMar>
-              <w:top w:w="0" w:type="dxa"/>
-              <w:start w:w="0" w:type="dxa"/>
-              <w:bottom w:w="0" w:type="dxa"/>
-              <w:end w:w="0" w:type="dxa"/>
-            </w:tcMar>
-            <w:tcBorders>
-              <w:top w:val="nil"/>
-              <w:bottom w:val="single" w:sz="5" w:space="0" w:color="CBD5E1"/>
-              <w:start w:val="nil"/>
-              <w:end w:val="nil"/>
-            </w:tcBorders>
-          </w:tcPr>
-          <w:p>
-            <w:pPr>
-              <w:spacing w:before="0" w:after="20" w:line="240" w:lineRule="auto"/>
-            </w:pPr>
-            <w:r>
-              <w:t xml:space="preserve"> </w:t>
-            </w:r>
-          </w:p>
-        </w:tc>
-      </w:tr>
-    </w:tbl>
-    <w:p>
-      <w:pPr>
-        <w:keepNext/>
-        <w:keepLines w:val="0"/>
-        <w:spacing w:before="80" w:after="20" w:line="293" w:lineRule="auto"/>
-      </w:pPr>
-      <w:r>
-        <w:rPr>
-          <w:rFonts w:ascii="Arial Unicode MS" w:hAnsi="Arial Unicode MS" w:eastAsia="Arial Unicode MS"/>
-          <w:b/>
-          <w:i w:val="0"/>
-          <w:color w:val="5B6573"/>
-          <w:sz w:val="22"/>
-        </w:rPr>
-        <w:t>局部修訂</w:t>
-      </w:r>
-      <w:r>
-        <w:rPr>
-          <w:rFonts w:ascii="Arial Unicode MS" w:hAnsi="Arial Unicode MS" w:eastAsia="Arial Unicode MS"/>
-          <w:b w:val="0"/>
-          <w:i w:val="0"/>
-          <w:color w:val="7B8491"/>
-          <w:sz w:val="22"/>
-        </w:rPr>
-        <w:t xml:space="preserve">  ｜  </w:t>
-      </w:r>
-      <w:r>
-        <w:rPr>
-          <w:rFonts w:ascii="Arial Unicode MS" w:hAnsi="Arial Unicode MS" w:eastAsia="Arial Unicode MS"/>
-          <w:b w:val="0"/>
-          <w:i w:val="0"/>
-          <w:color w:val="1A2340"/>
-          <w:sz w:val="22"/>
-        </w:rPr>
-        <w:t>我原本的句子：</w:t>
-      </w:r>
-    </w:p>
-    <w:tbl>
-      <w:tblPr>
-        <w:tblW w:type="dxa" w:w="9865"/>
-        <w:jc w:val="left"/>
-        <w:tblLayout w:type="fixed"/>
-        <w:tblLook w:firstColumn="1" w:firstRow="1" w:lastColumn="0" w:lastRow="0" w:noHBand="0" w:noVBand="1" w:val="04A0"/>
-        <w:tblInd w:type="dxa" w:w="0"/>
-      </w:tblPr>
-      <w:tblGrid>
-        <w:gridCol w:w="9865"/>
-      </w:tblGrid>
-      <w:tr>
-        <w:trPr>
-          <w:trHeight w:val="510" w:hRule="atLeast"/>
-        </w:trPr>
-        <w:tc>
-          <w:tcPr>
-            <w:tcW w:type="dxa" w:w="9865"/>
-            <w:tcMar>
-              <w:top w:w="0" w:type="dxa"/>
-              <w:start w:w="0" w:type="dxa"/>
-              <w:bottom w:w="0" w:type="dxa"/>
-              <w:end w:w="0" w:type="dxa"/>
-            </w:tcMar>
-            <w:tcBorders>
-              <w:top w:val="nil"/>
-              <w:bottom w:val="single" w:sz="5" w:space="0" w:color="CBD5E1"/>
-              <w:start w:val="nil"/>
-              <w:end w:val="nil"/>
-            </w:tcBorders>
-          </w:tcPr>
-          <w:p>
-            <w:pPr>
-              <w:spacing w:before="0" w:after="0" w:line="240" w:lineRule="auto"/>
-            </w:pPr>
-            <w:r>
-              <w:t xml:space="preserve"> </w:t>
-            </w:r>
-          </w:p>
-        </w:tc>
-      </w:tr>
-      <w:tr>
-        <w:trPr>
-          <w:trHeight w:val="510" w:hRule="atLeast"/>
-        </w:trPr>
-        <w:tc>
-          <w:tcPr>
-            <w:tcW w:type="dxa" w:w="9865"/>
-            <w:tcMar>
-              <w:top w:w="0" w:type="dxa"/>
-              <w:start w:w="0" w:type="dxa"/>
-              <w:bottom w:w="0" w:type="dxa"/>
-              <w:end w:w="0" w:type="dxa"/>
-            </w:tcMar>
-            <w:tcBorders>
-              <w:top w:val="nil"/>
-              <w:bottom w:val="single" w:sz="5" w:space="0" w:color="CBD5E1"/>
-              <w:start w:val="nil"/>
-              <w:end w:val="nil"/>
-            </w:tcBorders>
-          </w:tcPr>
-          <w:p>
-            <w:pPr>
-              <w:spacing w:before="0" w:after="20" w:line="240" w:lineRule="auto"/>
-            </w:pPr>
-            <w:r>
-              <w:t xml:space="preserve"> </w:t>
-            </w:r>
-          </w:p>
-        </w:tc>
-      </w:tr>
-    </w:tbl>
-    <w:p>
-      <w:pPr>
-        <w:keepNext/>
-        <w:keepLines w:val="0"/>
-        <w:spacing w:before="80" w:after="20" w:line="293" w:lineRule="auto"/>
-      </w:pPr>
-      <w:r>
-        <w:rPr>
-          <w:rFonts w:ascii="Arial Unicode MS" w:hAnsi="Arial Unicode MS" w:eastAsia="Arial Unicode MS"/>
-          <w:b/>
-          <w:i w:val="0"/>
-          <w:color w:val="5B6573"/>
-          <w:sz w:val="22"/>
-        </w:rPr>
-        <w:t>最後決定</w:t>
-      </w:r>
-      <w:r>
-        <w:rPr>
-          <w:rFonts w:ascii="Arial Unicode MS" w:hAnsi="Arial Unicode MS" w:eastAsia="Arial Unicode MS"/>
-          <w:b w:val="0"/>
-          <w:i w:val="0"/>
-          <w:color w:val="7B8491"/>
-          <w:sz w:val="22"/>
-        </w:rPr>
-        <w:t xml:space="preserve">  ｜  </w:t>
-      </w:r>
-      <w:r>
-        <w:rPr>
-          <w:rFonts w:ascii="Arial Unicode MS" w:hAnsi="Arial Unicode MS" w:eastAsia="Arial Unicode MS"/>
-          <w:b w:val="0"/>
-          <w:i w:val="0"/>
-          <w:color w:val="1A2340"/>
-          <w:sz w:val="22"/>
-        </w:rPr>
-        <w:t>我改寫後的句子；若保留就寫『保留原句』：</w:t>
-      </w:r>
-    </w:p>
-    <w:tbl>
-      <w:tblPr>
-        <w:tblW w:type="dxa" w:w="9865"/>
-        <w:jc w:val="left"/>
-        <w:tblLayout w:type="fixed"/>
-        <w:tblLook w:firstColumn="1" w:firstRow="1" w:lastColumn="0" w:lastRow="0" w:noHBand="0" w:noVBand="1" w:val="04A0"/>
-        <w:tblInd w:type="dxa" w:w="0"/>
-      </w:tblPr>
-      <w:tblGrid>
-        <w:gridCol w:w="9865"/>
-      </w:tblGrid>
-      <w:tr>
-        <w:trPr>
-          <w:trHeight w:val="510" w:hRule="atLeast"/>
-        </w:trPr>
-        <w:tc>
-          <w:tcPr>
-            <w:tcW w:type="dxa" w:w="9865"/>
-            <w:tcMar>
-              <w:top w:w="0" w:type="dxa"/>
-              <w:start w:w="0" w:type="dxa"/>
-              <w:bottom w:w="0" w:type="dxa"/>
-              <w:end w:w="0" w:type="dxa"/>
-            </w:tcMar>
-            <w:tcBorders>
-              <w:top w:val="nil"/>
-              <w:bottom w:val="single" w:sz="5" w:space="0" w:color="CBD5E1"/>
-              <w:start w:val="nil"/>
-              <w:end w:val="nil"/>
-            </w:tcBorders>
-          </w:tcPr>
-          <w:p>
-            <w:pPr>
-              <w:spacing w:before="0" w:after="0" w:line="240" w:lineRule="auto"/>
-            </w:pPr>
-            <w:r>
-              <w:t xml:space="preserve"> </w:t>
-            </w:r>
-          </w:p>
-        </w:tc>
-      </w:tr>
-      <w:tr>
-        <w:trPr>
-          <w:trHeight w:val="510" w:hRule="atLeast"/>
-        </w:trPr>
-        <w:tc>
-          <w:tcPr>
-            <w:tcW w:type="dxa" w:w="9865"/>
-            <w:tcMar>
-              <w:top w:w="0" w:type="dxa"/>
-              <w:start w:w="0" w:type="dxa"/>
-              <w:bottom w:w="0" w:type="dxa"/>
-              <w:end w:w="0" w:type="dxa"/>
-            </w:tcMar>
-            <w:tcBorders>
-              <w:top w:val="nil"/>
-              <w:bottom w:val="single" w:sz="5" w:space="0" w:color="CBD5E1"/>
-              <w:start w:val="nil"/>
-              <w:end w:val="nil"/>
-            </w:tcBorders>
-          </w:tcPr>
-          <w:p>
-            <w:pPr>
-              <w:spacing w:before="0" w:after="0" w:line="240" w:lineRule="auto"/>
-            </w:pPr>
-            <w:r>
-              <w:t xml:space="preserve"> </w:t>
-            </w:r>
-          </w:p>
-        </w:tc>
-      </w:tr>
-      <w:tr>
-        <w:trPr>
-          <w:trHeight w:val="510" w:hRule="atLeast"/>
-        </w:trPr>
-        <w:tc>
-          <w:tcPr>
-            <w:tcW w:type="dxa" w:w="9865"/>
-            <w:tcMar>
-              <w:top w:w="0" w:type="dxa"/>
-              <w:start w:w="0" w:type="dxa"/>
-              <w:bottom w:w="0" w:type="dxa"/>
-              <w:end w:w="0" w:type="dxa"/>
-            </w:tcMar>
-            <w:tcBorders>
-              <w:top w:val="nil"/>
-              <w:bottom w:val="single" w:sz="5" w:space="0" w:color="CBD5E1"/>
-              <w:start w:val="nil"/>
-              <w:end w:val="nil"/>
-            </w:tcBorders>
-          </w:tcPr>
-          <w:p>
-            <w:pPr>
-              <w:spacing w:before="0" w:after="20" w:line="240" w:lineRule="auto"/>
-            </w:pPr>
-            <w:r>
-              <w:t xml:space="preserve"> </w:t>
-            </w:r>
-          </w:p>
-        </w:tc>
-      </w:tr>
-    </w:tbl>
-    <w:p>
-      <w:pPr>
-        <w:keepNext/>
-        <w:keepLines w:val="0"/>
-        <w:spacing w:before="120" w:after="20" w:line="293" w:lineRule="auto"/>
-      </w:pPr>
-      <w:r>
-        <w:rPr>
-          <w:rFonts w:ascii="Arial Unicode MS" w:hAnsi="Arial Unicode MS" w:eastAsia="Arial Unicode MS"/>
-          <w:b/>
-          <w:i w:val="0"/>
-          <w:color w:val="1D4ED8"/>
-          <w:sz w:val="22"/>
-        </w:rPr>
-        <w:t>課堂必寫</w:t>
-      </w:r>
-      <w:r>
-        <w:rPr>
-          <w:rFonts w:ascii="Arial Unicode MS" w:hAnsi="Arial Unicode MS" w:eastAsia="Arial Unicode MS"/>
-          <w:b w:val="0"/>
-          <w:i w:val="0"/>
-          <w:color w:val="7B8491"/>
-          <w:sz w:val="22"/>
-        </w:rPr>
-        <w:t xml:space="preserve">  ｜  </w:t>
-      </w:r>
-      <w:r>
-        <w:rPr>
-          <w:rFonts w:ascii="Arial Unicode MS" w:hAnsi="Arial Unicode MS" w:eastAsia="Arial Unicode MS"/>
-          <w:b w:val="0"/>
-          <w:i w:val="0"/>
-          <w:color w:val="1A2340"/>
-          <w:sz w:val="22"/>
-        </w:rPr>
-        <w:t>我的最後決定｜判斷證據</w:t>
+        <w:t>作者座號＿＿＿　讀者座號＿＿＿。兩則回報各指畫面的位置、動作、先後或字；不確定也可以，不用猜作者心事。</w:t>
       </w:r>
     </w:p>
     <w:p>
       <w:pPr>
         <w:keepNext w:val="0"/>
         <w:keepLines w:val="0"/>
-        <w:spacing w:before="0" w:after="20" w:line="293" w:lineRule="auto"/>
+        <w:spacing w:before="0" w:after="60" w:line="293" w:lineRule="auto"/>
       </w:pPr>
       <w:r>
         <w:rPr>
@@ -2294,256 +984,7 @@
           <w:color w:val="1A2340"/>
           <w:sz w:val="22"/>
         </w:rPr>
-        <w:t>我最後改／保留 ______________，因為這一段的重點是 ______________________________</w:t>
-      </w:r>
-    </w:p>
-    <w:tbl>
-      <w:tblPr>
-        <w:tblW w:type="dxa" w:w="9865"/>
-        <w:jc w:val="left"/>
-        <w:tblLayout w:type="fixed"/>
-        <w:tblLook w:firstColumn="1" w:firstRow="1" w:lastColumn="0" w:lastRow="0" w:noHBand="0" w:noVBand="1" w:val="04A0"/>
-        <w:tblInd w:type="dxa" w:w="0"/>
-      </w:tblPr>
-      <w:tblGrid>
-        <w:gridCol w:w="9865"/>
-      </w:tblGrid>
-      <w:tr>
-        <w:trPr>
-          <w:trHeight w:val="510" w:hRule="atLeast"/>
-        </w:trPr>
-        <w:tc>
-          <w:tcPr>
-            <w:tcW w:type="dxa" w:w="9865"/>
-            <w:tcMar>
-              <w:top w:w="0" w:type="dxa"/>
-              <w:start w:w="0" w:type="dxa"/>
-              <w:bottom w:w="0" w:type="dxa"/>
-              <w:end w:w="0" w:type="dxa"/>
-            </w:tcMar>
-            <w:tcBorders>
-              <w:top w:val="nil"/>
-              <w:bottom w:val="single" w:sz="5" w:space="0" w:color="CBD5E1"/>
-              <w:start w:val="nil"/>
-              <w:end w:val="nil"/>
-            </w:tcBorders>
-          </w:tcPr>
-          <w:p>
-            <w:pPr>
-              <w:spacing w:before="0" w:after="0" w:line="240" w:lineRule="auto"/>
-            </w:pPr>
-            <w:r>
-              <w:t xml:space="preserve"> </w:t>
-            </w:r>
-          </w:p>
-        </w:tc>
-      </w:tr>
-      <w:tr>
-        <w:trPr>
-          <w:trHeight w:val="510" w:hRule="atLeast"/>
-        </w:trPr>
-        <w:tc>
-          <w:tcPr>
-            <w:tcW w:type="dxa" w:w="9865"/>
-            <w:tcMar>
-              <w:top w:w="0" w:type="dxa"/>
-              <w:start w:w="0" w:type="dxa"/>
-              <w:bottom w:w="0" w:type="dxa"/>
-              <w:end w:w="0" w:type="dxa"/>
-            </w:tcMar>
-            <w:tcBorders>
-              <w:top w:val="nil"/>
-              <w:bottom w:val="single" w:sz="5" w:space="0" w:color="CBD5E1"/>
-              <w:start w:val="nil"/>
-              <w:end w:val="nil"/>
-            </w:tcBorders>
-          </w:tcPr>
-          <w:p>
-            <w:pPr>
-              <w:spacing w:before="0" w:after="0" w:line="240" w:lineRule="auto"/>
-            </w:pPr>
-            <w:r>
-              <w:t xml:space="preserve"> </w:t>
-            </w:r>
-          </w:p>
-        </w:tc>
-      </w:tr>
-    </w:tbl>
-    <w:p>
-      <w:pPr>
-        <w:keepNext/>
-        <w:keepLines w:val="0"/>
-        <w:pageBreakBefore/>
-        <w:spacing w:before="0" w:after="60" w:line="293" w:lineRule="auto"/>
-      </w:pPr>
-      <w:r>
-        <w:rPr>
-          <w:rFonts w:ascii="JetBrains Mono" w:hAnsi="JetBrains Mono" w:eastAsia="Arial Unicode MS"/>
-          <w:b/>
-          <w:i w:val="0"/>
-          <w:color w:val="1D4ED8"/>
-          <w:sz w:val="22"/>
-        </w:rPr>
-        <w:t>W4 / 04</w:t>
-      </w:r>
-    </w:p>
-    <w:p>
-      <w:pPr>
-        <w:keepNext/>
-        <w:keepLines w:val="0"/>
-        <w:spacing w:before="0" w:after="80" w:line="252" w:lineRule="auto"/>
-      </w:pPr>
-      <w:r>
-        <w:rPr>
-          <w:rFonts w:ascii="Arial Unicode MS" w:hAnsi="Arial Unicode MS" w:eastAsia="Arial Unicode MS"/>
-          <w:b/>
-          <w:i w:val="0"/>
-          <w:color w:val="1A2340"/>
-          <w:sz w:val="44"/>
-        </w:rPr>
-        <w:t>換個情境，再試一次</w:t>
-      </w:r>
-    </w:p>
-    <w:p>
-      <w:pPr>
-        <w:keepNext w:val="0"/>
-        <w:keepLines w:val="0"/>
-        <w:spacing w:before="0" w:after="140" w:line="293" w:lineRule="auto"/>
-      </w:pPr>
-      <w:r>
-        <w:rPr>
-          <w:rFonts w:ascii="Arial Unicode MS" w:hAnsi="Arial Unicode MS" w:eastAsia="Arial Unicode MS"/>
-          <w:b w:val="0"/>
-          <w:i w:val="0"/>
-          <w:color w:val="5B6573"/>
-          <w:sz w:val="22"/>
-        </w:rPr>
-        <w:t>不計分、不列學習關卡；用題目情境，不必交出私事。</w:t>
-      </w:r>
-    </w:p>
-    <w:p>
-      <w:pPr>
-        <w:keepNext/>
-        <w:keepLines w:val="0"/>
-        <w:spacing w:before="100" w:after="40" w:line="293" w:lineRule="auto"/>
-      </w:pPr>
-      <w:r>
-        <w:rPr>
-          <w:rFonts w:ascii="JetBrains Mono" w:hAnsi="JetBrains Mono" w:eastAsia="Arial Unicode MS"/>
-          <w:b/>
-          <w:i w:val="0"/>
-          <w:color w:val="1D4ED8"/>
-          <w:sz w:val="30"/>
-        </w:rPr>
-        <w:t>生活</w:t>
-      </w:r>
-      <w:r>
-        <w:rPr>
-          <w:rFonts w:ascii="Arial Unicode MS" w:hAnsi="Arial Unicode MS" w:eastAsia="Arial Unicode MS"/>
-          <w:b w:val="0"/>
-          <w:i w:val="0"/>
-          <w:color w:val="1D4ED8"/>
-          <w:sz w:val="30"/>
-        </w:rPr>
-        <w:t xml:space="preserve">  </w:t>
-      </w:r>
-      <w:r>
-        <w:rPr>
-          <w:rFonts w:ascii="Arial Unicode MS" w:hAnsi="Arial Unicode MS" w:eastAsia="Arial Unicode MS"/>
-          <w:b/>
-          <w:i w:val="0"/>
-          <w:color w:val="1A2340"/>
-          <w:sz w:val="30"/>
-        </w:rPr>
-        <w:t>這樣約，大家找得到嗎？</w:t>
-      </w:r>
-    </w:p>
-    <w:p>
-      <w:pPr>
-        <w:keepNext w:val="0"/>
-        <w:keepLines w:val="0"/>
-        <w:spacing w:before="0" w:after="40" w:line="293" w:lineRule="auto"/>
-      </w:pPr>
-      <w:r>
-        <w:rPr>
-          <w:rFonts w:ascii="Arial Unicode MS" w:hAnsi="Arial Unicode MS" w:eastAsia="Arial Unicode MS"/>
-          <w:b w:val="0"/>
-          <w:i w:val="0"/>
-          <w:color w:val="5B6573"/>
-          <w:sz w:val="22"/>
-        </w:rPr>
-        <w:t>課堂練習｜不計分、不列學習關卡；整本照常收回。</w:t>
-      </w:r>
-    </w:p>
-    <w:p>
-      <w:pPr>
-        <w:keepNext w:val="0"/>
-        <w:keepLines w:val="0"/>
-        <w:spacing w:before="0" w:after="40" w:line="293" w:lineRule="auto"/>
-      </w:pPr>
-      <w:r>
-        <w:rPr>
-          <w:rFonts w:ascii="Arial Unicode MS" w:hAnsi="Arial Unicode MS" w:eastAsia="Arial Unicode MS"/>
-          <w:b w:val="0"/>
-          <w:i w:val="0"/>
-          <w:color w:val="1A2340"/>
-          <w:sz w:val="22"/>
-        </w:rPr>
-        <w:t>你要通知新社員領球衣：週五十二點二十分，在體育館一樓門口，由你發放。草稿只寫『星期五老地方找我拿。』</w:t>
-      </w:r>
-    </w:p>
-    <w:p>
-      <w:pPr>
-        <w:keepNext w:val="0"/>
-        <w:keepLines w:val="0"/>
-        <w:spacing w:before="0" w:after="40" w:line="293" w:lineRule="auto"/>
-      </w:pPr>
-      <w:r>
-        <w:rPr>
-          <w:rFonts w:ascii="Arial Unicode MS" w:hAnsi="Arial Unicode MS" w:eastAsia="Arial Unicode MS"/>
-          <w:b w:val="0"/>
-          <w:i w:val="0"/>
-          <w:color w:val="1A2340"/>
-          <w:sz w:val="22"/>
-        </w:rPr>
-        <w:t>把通知改成新社員看得懂的版本。請同學只看文字，說出他會何時到哪裡、找誰做什麼。</w:t>
-      </w:r>
-    </w:p>
-    <w:p>
-      <w:pPr>
-        <w:keepNext/>
-        <w:keepLines w:val="0"/>
-        <w:spacing w:before="20" w:after="20" w:line="293" w:lineRule="auto"/>
-      </w:pPr>
-      <w:r>
-        <w:rPr>
-          <w:rFonts w:ascii="Arial Unicode MS" w:hAnsi="Arial Unicode MS" w:eastAsia="Arial Unicode MS"/>
-          <w:b/>
-          <w:i w:val="0"/>
-          <w:color w:val="5B6573"/>
-          <w:sz w:val="22"/>
-        </w:rPr>
-        <w:t>先做一次</w:t>
-      </w:r>
-      <w:r>
-        <w:rPr>
-          <w:rFonts w:ascii="Arial Unicode MS" w:hAnsi="Arial Unicode MS" w:eastAsia="Arial Unicode MS"/>
-          <w:b w:val="0"/>
-          <w:i w:val="0"/>
-          <w:color w:val="7B8491"/>
-          <w:sz w:val="22"/>
-        </w:rPr>
-        <w:t xml:space="preserve">  ｜  </w:t>
-      </w:r>
-      <w:r>
-        <w:rPr>
-          <w:rFonts w:ascii="Arial Unicode MS" w:hAnsi="Arial Unicode MS" w:eastAsia="Arial Unicode MS"/>
-          <w:b w:val="0"/>
-          <w:i w:val="0"/>
-          <w:color w:val="1A2340"/>
-          <w:sz w:val="22"/>
-        </w:rPr>
-        <w:t>我的通知／讀者真的說</w:t>
+        <w:t>① 我看成＿＿，因為作品的＿＿有＿＿：</w:t>
       </w:r>
     </w:p>
     <w:tbl>
@@ -2652,24 +1093,7 @@
       <w:pPr>
         <w:keepNext w:val="0"/>
         <w:keepLines w:val="0"/>
-        <w:spacing w:before="60" w:after="40" w:line="293" w:lineRule="auto"/>
-      </w:pPr>
-      <w:r>
-        <w:rPr>
-          <w:rFonts w:ascii="Arial Unicode MS" w:hAnsi="Arial Unicode MS" w:eastAsia="Arial Unicode MS"/>
-          <w:b/>
-          <w:i w:val="0"/>
-          <w:color w:val="1A2340"/>
-          <w:sz w:val="22"/>
-        </w:rPr>
-        <w:t>先寫完，再看：新社員不知道『老地方』在哪裡，也不知道你是哪一位。</w:t>
-      </w:r>
-    </w:p>
-    <w:p>
-      <w:pPr>
-        <w:keepNext w:val="0"/>
-        <w:keepLines w:val="0"/>
-        <w:spacing w:before="0" w:after="40" w:line="293" w:lineRule="auto"/>
+        <w:spacing w:before="0" w:after="60" w:line="293" w:lineRule="auto"/>
       </w:pPr>
       <w:r>
         <w:rPr>
@@ -2679,44 +1103,7 @@
           <w:color w:val="1A2340"/>
           <w:sz w:val="22"/>
         </w:rPr>
-        <w:t>把同學真的說出的做法記下來；只補最需要的一處，再讓他說一次。</w:t>
-      </w:r>
-    </w:p>
-    <w:p>
-      <w:pPr>
-        <w:keepNext/>
-        <w:keepLines w:val="0"/>
-        <w:spacing w:before="20" w:after="20" w:line="293" w:lineRule="auto"/>
-      </w:pPr>
-      <w:r>
-        <w:rPr>
-          <w:rFonts w:ascii="Arial Unicode MS" w:hAnsi="Arial Unicode MS" w:eastAsia="Arial Unicode MS"/>
-          <w:b/>
-          <w:i w:val="0"/>
-          <w:color w:val="5B6573"/>
-          <w:sz w:val="22"/>
-        </w:rPr>
-        <w:t>再決定</w:t>
-      </w:r>
-      <w:r>
-        <w:rPr>
-          <w:rFonts w:ascii="Arial Unicode MS" w:hAnsi="Arial Unicode MS" w:eastAsia="Arial Unicode MS"/>
-          <w:b w:val="0"/>
-          <w:i w:val="0"/>
-          <w:color w:val="7B8491"/>
-          <w:sz w:val="22"/>
-        </w:rPr>
-        <w:t xml:space="preserve">  ｜  </w:t>
-      </w:r>
-      <w:r>
-        <w:rPr>
-          <w:rFonts w:ascii="Arial Unicode MS" w:hAnsi="Arial Unicode MS" w:eastAsia="Arial Unicode MS"/>
-          <w:b w:val="0"/>
-          <w:i w:val="0"/>
-          <w:color w:val="1A2340"/>
-          <w:sz w:val="22"/>
-        </w:rPr>
-        <w:t>我補的一處／再讀一次的結果</w:t>
+        <w:t>② 我還看到／拿不準＿＿，根據是＿＿：</w:t>
       </w:r>
     </w:p>
     <w:tbl>
@@ -2835,7 +1222,7 @@
           <w:color w:val="1D4ED8"/>
           <w:sz w:val="30"/>
         </w:rPr>
-        <w:t>下一週</w:t>
+        <w:t>07</w:t>
       </w:r>
       <w:r>
         <w:rPr>
@@ -2855,14 +1242,14 @@
           <w:color w:val="1A2340"/>
           <w:sz w:val="30"/>
         </w:rPr>
-        <w:t>W5 上課前</w:t>
+        <w:t>72 分打開原意，再比較</w:t>
       </w:r>
     </w:p>
     <w:p>
       <w:pPr>
         <w:keepNext w:val="0"/>
         <w:keepLines w:val="0"/>
-        <w:spacing w:before="0" w:after="20" w:line="293" w:lineRule="auto"/>
+        <w:spacing w:before="0" w:after="60" w:line="293" w:lineRule="auto"/>
       </w:pPr>
       <w:r>
         <w:rPr>
@@ -2872,7 +1259,120 @@
           <w:color w:val="1A2340"/>
           <w:sz w:val="22"/>
         </w:rPr>
-        <w:t>回讀 W2，列三個最想修的地方和簡短理由；先不要重寫。</w:t>
+        <w:t>□ 大致相同　□ 部分讀到　□ 不同。回原頁圈關鍵片段，不整段重抄。</w:t>
+      </w:r>
+    </w:p>
+    <w:p>
+      <w:pPr>
+        <w:keepNext w:val="0"/>
+        <w:keepLines w:val="0"/>
+        <w:spacing w:before="0" w:after="60" w:line="293" w:lineRule="auto"/>
+      </w:pPr>
+      <w:r>
+        <w:rPr>
+          <w:rFonts w:ascii="Arial Unicode MS" w:hAnsi="Arial Unicode MS" w:eastAsia="Arial Unicode MS"/>
+          <w:b w:val="0"/>
+          <w:i w:val="0"/>
+          <w:color w:val="1A2340"/>
+          <w:sz w:val="22"/>
+        </w:rPr>
+        <w:t>這次要處理的落差，或已經表達清楚的地方：</w:t>
+      </w:r>
+    </w:p>
+    <w:tbl>
+      <w:tblPr>
+        <w:tblW w:type="dxa" w:w="9865"/>
+        <w:jc w:val="left"/>
+        <w:tblLayout w:type="fixed"/>
+        <w:tblLook w:firstColumn="1" w:firstRow="1" w:lastColumn="0" w:lastRow="0" w:noHBand="0" w:noVBand="1" w:val="04A0"/>
+        <w:tblInd w:type="dxa" w:w="0"/>
+      </w:tblPr>
+      <w:tblGrid>
+        <w:gridCol w:w="9865"/>
+      </w:tblGrid>
+      <w:tr>
+        <w:trPr>
+          <w:trHeight w:val="510" w:hRule="atLeast"/>
+        </w:trPr>
+        <w:tc>
+          <w:tcPr>
+            <w:tcW w:type="dxa" w:w="9865"/>
+            <w:tcMar>
+              <w:top w:w="0" w:type="dxa"/>
+              <w:start w:w="0" w:type="dxa"/>
+              <w:bottom w:w="0" w:type="dxa"/>
+              <w:end w:w="0" w:type="dxa"/>
+            </w:tcMar>
+            <w:tcBorders>
+              <w:top w:val="nil"/>
+              <w:bottom w:val="single" w:sz="5" w:space="0" w:color="CBD5E1"/>
+              <w:start w:val="nil"/>
+              <w:end w:val="nil"/>
+            </w:tcBorders>
+          </w:tcPr>
+          <w:p>
+            <w:pPr>
+              <w:spacing w:before="0" w:after="20" w:line="240" w:lineRule="auto"/>
+            </w:pPr>
+            <w:r>
+              <w:t xml:space="preserve"> </w:t>
+            </w:r>
+          </w:p>
+        </w:tc>
+      </w:tr>
+    </w:tbl>
+    <w:p>
+      <w:pPr>
+        <w:keepNext/>
+        <w:keepLines w:val="0"/>
+        <w:spacing w:before="100" w:after="100" w:line="293" w:lineRule="auto"/>
+      </w:pPr>
+      <w:r>
+        <w:rPr>
+          <w:rFonts w:ascii="JetBrains Mono" w:hAnsi="JetBrains Mono" w:eastAsia="Arial Unicode MS"/>
+          <w:b/>
+          <w:i w:val="0"/>
+          <w:color w:val="1D4ED8"/>
+          <w:sz w:val="30"/>
+        </w:rPr>
+        <w:t>08</w:t>
+      </w:r>
+      <w:r>
+        <w:rPr>
+          <w:rFonts w:ascii="Arial Unicode MS" w:hAnsi="Arial Unicode MS" w:eastAsia="Arial Unicode MS"/>
+          <w:b w:val="0"/>
+          <w:i w:val="0"/>
+          <w:color w:val="1D4ED8"/>
+          <w:sz w:val="30"/>
+        </w:rPr>
+        <w:t xml:space="preserve">  </w:t>
+      </w:r>
+      <w:r>
+        <w:rPr>
+          <w:rFonts w:ascii="Arial Unicode MS" w:hAnsi="Arial Unicode MS" w:eastAsia="Arial Unicode MS"/>
+          <w:b/>
+          <w:i w:val="0"/>
+          <w:color w:val="1A2340"/>
+          <w:sz w:val="30"/>
+        </w:rPr>
+        <w:t>我決定改或保留</w:t>
+      </w:r>
+    </w:p>
+    <w:p>
+      <w:pPr>
+        <w:keepNext w:val="0"/>
+        <w:keepLines w:val="0"/>
+        <w:spacing w:before="0" w:after="60" w:line="293" w:lineRule="auto"/>
+      </w:pPr>
+      <w:r>
+        <w:rPr>
+          <w:rFonts w:ascii="Arial Unicode MS" w:hAnsi="Arial Unicode MS" w:eastAsia="Arial Unicode MS"/>
+          <w:b w:val="0"/>
+          <w:i w:val="0"/>
+          <w:color w:val="1A2340"/>
+          <w:sz w:val="22"/>
+        </w:rPr>
+        <w:t>我改／保留＿＿，因為回報＿＿；這有沒有支持我的原意？</w:t>
       </w:r>
     </w:p>
     <w:tbl>
@@ -2938,6 +1438,240 @@
           </w:tcPr>
           <w:p>
             <w:pPr>
+              <w:spacing w:before="0" w:after="20" w:line="240" w:lineRule="auto"/>
+            </w:pPr>
+            <w:r>
+              <w:t xml:space="preserve"> </w:t>
+            </w:r>
+          </w:p>
+        </w:tc>
+      </w:tr>
+    </w:tbl>
+    <w:p>
+      <w:pPr>
+        <w:keepNext w:val="0"/>
+        <w:keepLines w:val="0"/>
+        <w:spacing w:before="0" w:after="60" w:line="293" w:lineRule="auto"/>
+      </w:pPr>
+      <w:r>
+        <w:rPr>
+          <w:rFonts w:ascii="Arial Unicode MS" w:hAnsi="Arial Unicode MS" w:eastAsia="Arial Unicode MS"/>
+          <w:b w:val="0"/>
+          <w:i w:val="0"/>
+          <w:color w:val="1A2340"/>
+          <w:sz w:val="22"/>
+        </w:rPr>
+        <w:t>V1 不覆寫。□ 保留 V1　□ 另存 V2　□ 下框畫局部修改</w:t>
+      </w:r>
+    </w:p>
+    <w:tbl>
+      <w:tblPr>
+        <w:tblW w:type="dxa" w:w="9865"/>
+        <w:jc w:val="left"/>
+        <w:tblLayout w:type="fixed"/>
+        <w:tblLook w:firstColumn="1" w:firstRow="1" w:lastColumn="0" w:lastRow="0" w:noHBand="0" w:noVBand="1" w:val="04A0"/>
+        <w:tblInd w:type="dxa" w:w="0"/>
+      </w:tblPr>
+      <w:tblGrid>
+        <w:gridCol w:w="9865"/>
+      </w:tblGrid>
+      <w:tr>
+        <w:trPr>
+          <w:trHeight w:val="2268" w:hRule="atLeast"/>
+        </w:trPr>
+        <w:tc>
+          <w:tcPr>
+            <w:tcW w:type="dxa" w:w="9865"/>
+            <w:tcMar>
+              <w:top w:w="80" w:type="dxa"/>
+              <w:start w:w="100" w:type="dxa"/>
+              <w:bottom w:w="80" w:type="dxa"/>
+              <w:end w:w="100" w:type="dxa"/>
+            </w:tcMar>
+            <w:tcBorders>
+              <w:top w:val="single" w:sz="5" w:space="0" w:color="CBD5E1"/>
+              <w:bottom w:val="single" w:sz="5" w:space="0" w:color="CBD5E1"/>
+              <w:start w:val="single" w:sz="5" w:space="0" w:color="CBD5E1"/>
+              <w:end w:val="single" w:sz="5" w:space="0" w:color="CBD5E1"/>
+            </w:tcBorders>
+          </w:tcPr>
+          <w:p/>
+        </w:tc>
+      </w:tr>
+    </w:tbl>
+    <w:p>
+      <w:pPr>
+        <w:keepNext w:val="0"/>
+        <w:keepLines w:val="0"/>
+        <w:spacing w:before="0" w:after="0" w:line="293" w:lineRule="auto"/>
+      </w:pPr>
+      <w:r>
+        <w:rPr>
+          <w:rFonts w:ascii="Arial Unicode MS" w:hAnsi="Arial Unicode MS" w:eastAsia="Arial Unicode MS"/>
+          <w:b w:val="0"/>
+          <w:i w:val="0"/>
+          <w:color w:val="1A2340"/>
+          <w:sz w:val="22"/>
+        </w:rPr>
+        <w:t>數位 V2 檔名（有改才填）＿＿＿＿＿＿。一位讀者的回報不能代表所有人。</w:t>
+      </w:r>
+    </w:p>
+    <w:p>
+      <w:pPr>
+        <w:keepNext/>
+        <w:keepLines w:val="0"/>
+        <w:pageBreakBefore/>
+        <w:spacing w:before="0" w:after="60" w:line="293" w:lineRule="auto"/>
+      </w:pPr>
+      <w:r>
+        <w:rPr>
+          <w:rFonts w:ascii="JetBrains Mono" w:hAnsi="JetBrains Mono" w:eastAsia="Arial Unicode MS"/>
+          <w:b/>
+          <w:i w:val="0"/>
+          <w:color w:val="1D4ED8"/>
+          <w:sz w:val="22"/>
+        </w:rPr>
+        <w:t>W4 / 04</w:t>
+      </w:r>
+    </w:p>
+    <w:p>
+      <w:pPr>
+        <w:keepNext/>
+        <w:keepLines w:val="0"/>
+        <w:spacing w:before="0" w:after="80" w:line="252" w:lineRule="auto"/>
+      </w:pPr>
+      <w:r>
+        <w:rPr>
+          <w:rFonts w:ascii="Arial Unicode MS" w:hAnsi="Arial Unicode MS" w:eastAsia="Arial Unicode MS"/>
+          <w:b/>
+          <w:i w:val="0"/>
+          <w:color w:val="1A2340"/>
+          <w:sz w:val="44"/>
+        </w:rPr>
+        <w:t>回到文字，換個情境再試</w:t>
+      </w:r>
+    </w:p>
+    <w:p>
+      <w:pPr>
+        <w:keepNext w:val="0"/>
+        <w:keepLines w:val="0"/>
+        <w:spacing w:before="0" w:after="140" w:line="293" w:lineRule="auto"/>
+      </w:pPr>
+      <w:r>
+        <w:rPr>
+          <w:rFonts w:ascii="Arial Unicode MS" w:hAnsi="Arial Unicode MS" w:eastAsia="Arial Unicode MS"/>
+          <w:b w:val="0"/>
+          <w:i w:val="0"/>
+          <w:color w:val="5B6573"/>
+          <w:sz w:val="22"/>
+        </w:rPr>
+        <w:t>先前的圖像經驗，能不能幫這一次表達？</w:t>
+      </w:r>
+    </w:p>
+    <w:p>
+      <w:pPr>
+        <w:keepNext/>
+        <w:keepLines w:val="0"/>
+        <w:spacing w:before="60" w:after="100" w:line="293" w:lineRule="auto"/>
+      </w:pPr>
+      <w:r>
+        <w:rPr>
+          <w:rFonts w:ascii="JetBrains Mono" w:hAnsi="JetBrains Mono" w:eastAsia="Arial Unicode MS"/>
+          <w:b/>
+          <w:i w:val="0"/>
+          <w:color w:val="1D4ED8"/>
+          <w:sz w:val="30"/>
+        </w:rPr>
+        <w:t>09</w:t>
+      </w:r>
+      <w:r>
+        <w:rPr>
+          <w:rFonts w:ascii="Arial Unicode MS" w:hAnsi="Arial Unicode MS" w:eastAsia="Arial Unicode MS"/>
+          <w:b w:val="0"/>
+          <w:i w:val="0"/>
+          <w:color w:val="1D4ED8"/>
+          <w:sz w:val="30"/>
+        </w:rPr>
+        <w:t xml:space="preserve">  </w:t>
+      </w:r>
+      <w:r>
+        <w:rPr>
+          <w:rFonts w:ascii="Arial Unicode MS" w:hAnsi="Arial Unicode MS" w:eastAsia="Arial Unicode MS"/>
+          <w:b/>
+          <w:i w:val="0"/>
+          <w:color w:val="1A2340"/>
+          <w:sz w:val="30"/>
+        </w:rPr>
+        <w:t>自己的素材：只處理一句</w:t>
+      </w:r>
+    </w:p>
+    <w:p>
+      <w:pPr>
+        <w:keepNext w:val="0"/>
+        <w:keepLines w:val="0"/>
+        <w:spacing w:before="0" w:after="60" w:line="293" w:lineRule="auto"/>
+      </w:pPr>
+      <w:r>
+        <w:rPr>
+          <w:rFonts w:ascii="Arial Unicode MS" w:hAnsi="Arial Unicode MS" w:eastAsia="Arial Unicode MS"/>
+          <w:b w:val="0"/>
+          <w:i w:val="0"/>
+          <w:color w:val="1A2340"/>
+          <w:sz w:val="22"/>
+        </w:rPr>
+        <w:t>素材原句／自編初句：＿＿＿＿＿＿＿＿＿＿＿＿＿＿＿</w:t>
+      </w:r>
+    </w:p>
+    <w:p>
+      <w:pPr>
+        <w:keepNext w:val="0"/>
+        <w:keepLines w:val="0"/>
+        <w:spacing w:before="0" w:after="60" w:line="293" w:lineRule="auto"/>
+      </w:pPr>
+      <w:r>
+        <w:rPr>
+          <w:rFonts w:ascii="Arial Unicode MS" w:hAnsi="Arial Unicode MS" w:eastAsia="Arial Unicode MS"/>
+          <w:b w:val="0"/>
+          <w:i w:val="0"/>
+          <w:color w:val="1A2340"/>
+          <w:sz w:val="22"/>
+        </w:rPr>
+        <w:t>新句／保留理由：</w:t>
+      </w:r>
+    </w:p>
+    <w:tbl>
+      <w:tblPr>
+        <w:tblW w:type="dxa" w:w="9865"/>
+        <w:jc w:val="left"/>
+        <w:tblLayout w:type="fixed"/>
+        <w:tblLook w:firstColumn="1" w:firstRow="1" w:lastColumn="0" w:lastRow="0" w:noHBand="0" w:noVBand="1" w:val="04A0"/>
+        <w:tblInd w:type="dxa" w:w="0"/>
+      </w:tblPr>
+      <w:tblGrid>
+        <w:gridCol w:w="9865"/>
+      </w:tblGrid>
+      <w:tr>
+        <w:trPr>
+          <w:trHeight w:val="510" w:hRule="atLeast"/>
+        </w:trPr>
+        <w:tc>
+          <w:tcPr>
+            <w:tcW w:type="dxa" w:w="9865"/>
+            <w:tcMar>
+              <w:top w:w="0" w:type="dxa"/>
+              <w:start w:w="0" w:type="dxa"/>
+              <w:bottom w:w="0" w:type="dxa"/>
+              <w:end w:w="0" w:type="dxa"/>
+            </w:tcMar>
+            <w:tcBorders>
+              <w:top w:val="nil"/>
+              <w:bottom w:val="single" w:sz="5" w:space="0" w:color="CBD5E1"/>
+              <w:start w:val="nil"/>
+              <w:end w:val="nil"/>
+            </w:tcBorders>
+          </w:tcPr>
+          <w:p>
+            <w:pPr>
               <w:spacing w:before="0" w:after="0" w:line="240" w:lineRule="auto"/>
             </w:pPr>
             <w:r>
@@ -2968,7 +1702,7 @@
           </w:tcPr>
           <w:p>
             <w:pPr>
-              <w:spacing w:before="0" w:after="0" w:line="240" w:lineRule="auto"/>
+              <w:spacing w:before="0" w:after="20" w:line="240" w:lineRule="auto"/>
             </w:pPr>
             <w:r>
               <w:t xml:space="preserve"> </w:t>
@@ -2981,17 +1715,423 @@
       <w:pPr>
         <w:keepNext w:val="0"/>
         <w:keepLines w:val="0"/>
-        <w:spacing w:before="100" w:after="0" w:line="293" w:lineRule="auto"/>
+        <w:spacing w:before="0" w:after="60" w:line="293" w:lineRule="auto"/>
+      </w:pPr>
+      <w:r>
+        <w:rPr>
+          <w:rFonts w:ascii="Arial Unicode MS" w:hAnsi="Arial Unicode MS" w:eastAsia="Arial Unicode MS"/>
+          <w:b w:val="0"/>
+          <w:i w:val="0"/>
+          <w:color w:val="1A2340"/>
+          <w:sz w:val="22"/>
+        </w:rPr>
+        <w:t>遮住圖，請同學只讀這句。讀者說＿＿＿＿＿＿＿＿＿＿</w:t>
+      </w:r>
+    </w:p>
+    <w:p>
+      <w:pPr>
+        <w:keepNext w:val="0"/>
+        <w:keepLines w:val="0"/>
+        <w:spacing w:before="0" w:after="60" w:line="293" w:lineRule="auto"/>
+      </w:pPr>
+      <w:r>
+        <w:rPr>
+          <w:rFonts w:ascii="Arial Unicode MS" w:hAnsi="Arial Unicode MS" w:eastAsia="Arial Unicode MS"/>
+          <w:b w:val="0"/>
+          <w:i w:val="0"/>
+          <w:color w:val="1A2340"/>
+          <w:sz w:val="22"/>
+        </w:rPr>
+        <w:t>指出的詞＿＿＿＿＿＿＿；我判斷清楚／還缺＿＿＿＿＿</w:t>
+      </w:r>
+    </w:p>
+    <w:p>
+      <w:pPr>
+        <w:keepNext/>
+        <w:keepLines w:val="0"/>
+        <w:spacing w:before="100" w:after="100" w:line="293" w:lineRule="auto"/>
+      </w:pPr>
+      <w:r>
+        <w:rPr>
+          <w:rFonts w:ascii="JetBrains Mono" w:hAnsi="JetBrains Mono" w:eastAsia="Arial Unicode MS"/>
+          <w:b/>
+          <w:i w:val="0"/>
+          <w:color w:val="1D4ED8"/>
+          <w:sz w:val="30"/>
+        </w:rPr>
+        <w:t>10</w:t>
+      </w:r>
+      <w:r>
+        <w:rPr>
+          <w:rFonts w:ascii="Arial Unicode MS" w:hAnsi="Arial Unicode MS" w:eastAsia="Arial Unicode MS"/>
+          <w:b w:val="0"/>
+          <w:i w:val="0"/>
+          <w:color w:val="1D4ED8"/>
+          <w:sz w:val="30"/>
+        </w:rPr>
+        <w:t xml:space="preserve">  </w:t>
+      </w:r>
+      <w:r>
+        <w:rPr>
+          <w:rFonts w:ascii="Arial Unicode MS" w:hAnsi="Arial Unicode MS" w:eastAsia="Arial Unicode MS"/>
+          <w:b/>
+          <w:i w:val="0"/>
+          <w:color w:val="1A2340"/>
+          <w:sz w:val="30"/>
+        </w:rPr>
+        <w:t>生活練習：這樣約，大家找得到嗎？</w:t>
+      </w:r>
+    </w:p>
+    <w:p>
+      <w:pPr>
+        <w:keepNext w:val="0"/>
+        <w:keepLines w:val="0"/>
+        <w:spacing w:before="0" w:after="60" w:line="293" w:lineRule="auto"/>
+      </w:pPr>
+      <w:r>
+        <w:rPr>
+          <w:rFonts w:ascii="Arial Unicode MS" w:hAnsi="Arial Unicode MS" w:eastAsia="Arial Unicode MS"/>
+          <w:b w:val="0"/>
+          <w:i w:val="0"/>
+          <w:color w:val="1A2340"/>
+          <w:sz w:val="22"/>
+        </w:rPr>
+        <w:t>你在週五 12:20，體育館一樓門口、藍色球衣箱旁發球衣。先通知認識你、知道老地方的舊社員。群組草稿：「星期五老地方找我拿。」</w:t>
+      </w:r>
+    </w:p>
+    <w:p>
+      <w:pPr>
+        <w:keepNext w:val="0"/>
+        <w:keepLines w:val="0"/>
+        <w:spacing w:before="0" w:after="60" w:line="293" w:lineRule="auto"/>
+      </w:pPr>
+      <w:r>
+        <w:rPr>
+          <w:rFonts w:ascii="Arial Unicode MS" w:hAnsi="Arial Unicode MS" w:eastAsia="Arial Unicode MS"/>
+          <w:b w:val="0"/>
+          <w:i w:val="0"/>
+          <w:color w:val="1A2340"/>
+          <w:sz w:val="22"/>
+        </w:rPr>
+        <w:t>各寫通知再互讀。讀者說「我會在＿，到＿，找＿領＿」；缺的直接說。</w:t>
+      </w:r>
+    </w:p>
+    <w:p>
+      <w:pPr>
+        <w:keepNext w:val="0"/>
+        <w:keepLines w:val="0"/>
+        <w:spacing w:before="0" w:after="60" w:line="293" w:lineRule="auto"/>
+      </w:pPr>
+      <w:r>
+        <w:rPr>
+          <w:rFonts w:ascii="Arial Unicode MS" w:hAnsi="Arial Unicode MS" w:eastAsia="Arial Unicode MS"/>
+          <w:b w:val="0"/>
+          <w:i w:val="0"/>
+          <w:color w:val="1A2340"/>
+          <w:sz w:val="22"/>
+        </w:rPr>
+        <w:t>我的通知／讀者真的說：</w:t>
+      </w:r>
+    </w:p>
+    <w:tbl>
+      <w:tblPr>
+        <w:tblW w:type="dxa" w:w="9865"/>
+        <w:jc w:val="left"/>
+        <w:tblLayout w:type="fixed"/>
+        <w:tblLook w:firstColumn="1" w:firstRow="1" w:lastColumn="0" w:lastRow="0" w:noHBand="0" w:noVBand="1" w:val="04A0"/>
+        <w:tblInd w:type="dxa" w:w="0"/>
+      </w:tblPr>
+      <w:tblGrid>
+        <w:gridCol w:w="9865"/>
+      </w:tblGrid>
+      <w:tr>
+        <w:trPr>
+          <w:trHeight w:val="510" w:hRule="atLeast"/>
+        </w:trPr>
+        <w:tc>
+          <w:tcPr>
+            <w:tcW w:type="dxa" w:w="9865"/>
+            <w:tcMar>
+              <w:top w:w="0" w:type="dxa"/>
+              <w:start w:w="0" w:type="dxa"/>
+              <w:bottom w:w="0" w:type="dxa"/>
+              <w:end w:w="0" w:type="dxa"/>
+            </w:tcMar>
+            <w:tcBorders>
+              <w:top w:val="nil"/>
+              <w:bottom w:val="single" w:sz="5" w:space="0" w:color="CBD5E1"/>
+              <w:start w:val="nil"/>
+              <w:end w:val="nil"/>
+            </w:tcBorders>
+          </w:tcPr>
+          <w:p>
+            <w:pPr>
+              <w:spacing w:before="0" w:after="0" w:line="240" w:lineRule="auto"/>
+            </w:pPr>
+            <w:r>
+              <w:t xml:space="preserve"> </w:t>
+            </w:r>
+          </w:p>
+        </w:tc>
+      </w:tr>
+      <w:tr>
+        <w:trPr>
+          <w:trHeight w:val="510" w:hRule="atLeast"/>
+        </w:trPr>
+        <w:tc>
+          <w:tcPr>
+            <w:tcW w:type="dxa" w:w="9865"/>
+            <w:tcMar>
+              <w:top w:w="0" w:type="dxa"/>
+              <w:start w:w="0" w:type="dxa"/>
+              <w:bottom w:w="0" w:type="dxa"/>
+              <w:end w:w="0" w:type="dxa"/>
+            </w:tcMar>
+            <w:tcBorders>
+              <w:top w:val="nil"/>
+              <w:bottom w:val="single" w:sz="5" w:space="0" w:color="CBD5E1"/>
+              <w:start w:val="nil"/>
+              <w:end w:val="nil"/>
+            </w:tcBorders>
+          </w:tcPr>
+          <w:p>
+            <w:pPr>
+              <w:spacing w:before="0" w:after="20" w:line="240" w:lineRule="auto"/>
+            </w:pPr>
+            <w:r>
+              <w:t xml:space="preserve"> </w:t>
+            </w:r>
+          </w:p>
+        </w:tc>
+      </w:tr>
+    </w:tbl>
+    <w:p>
+      <w:pPr>
+        <w:keepNext w:val="0"/>
+        <w:keepLines w:val="0"/>
+        <w:spacing w:before="0" w:after="60" w:line="293" w:lineRule="auto"/>
+      </w:pPr>
+      <w:r>
+        <w:rPr>
+          <w:rFonts w:ascii="Arial Unicode MS" w:hAnsi="Arial Unicode MS" w:eastAsia="Arial Unicode MS"/>
+          <w:b w:val="0"/>
+          <w:i w:val="0"/>
+          <w:color w:val="1A2340"/>
+          <w:sz w:val="22"/>
+        </w:rPr>
+        <w:t>93 分才聽新條件，先請同學再讀原通知。保留初答，補一處或圈字保留，最後互讀確認。</w:t>
+      </w:r>
+    </w:p>
+    <w:p>
+      <w:pPr>
+        <w:keepNext w:val="0"/>
+        <w:keepLines w:val="0"/>
+        <w:spacing w:before="0" w:after="60" w:line="293" w:lineRule="auto"/>
+      </w:pPr>
+      <w:r>
+        <w:rPr>
+          <w:rFonts w:ascii="Arial Unicode MS" w:hAnsi="Arial Unicode MS" w:eastAsia="Arial Unicode MS"/>
+          <w:b w:val="0"/>
+          <w:i w:val="0"/>
+          <w:color w:val="1A2340"/>
+          <w:sz w:val="22"/>
+        </w:rPr>
+        <w:t>我改或保留／再讀一次的結果：</w:t>
+      </w:r>
+    </w:p>
+    <w:tbl>
+      <w:tblPr>
+        <w:tblW w:type="dxa" w:w="9865"/>
+        <w:jc w:val="left"/>
+        <w:tblLayout w:type="fixed"/>
+        <w:tblLook w:firstColumn="1" w:firstRow="1" w:lastColumn="0" w:lastRow="0" w:noHBand="0" w:noVBand="1" w:val="04A0"/>
+        <w:tblInd w:type="dxa" w:w="0"/>
+      </w:tblPr>
+      <w:tblGrid>
+        <w:gridCol w:w="9865"/>
+      </w:tblGrid>
+      <w:tr>
+        <w:trPr>
+          <w:trHeight w:val="510" w:hRule="atLeast"/>
+        </w:trPr>
+        <w:tc>
+          <w:tcPr>
+            <w:tcW w:type="dxa" w:w="9865"/>
+            <w:tcMar>
+              <w:top w:w="0" w:type="dxa"/>
+              <w:start w:w="0" w:type="dxa"/>
+              <w:bottom w:w="0" w:type="dxa"/>
+              <w:end w:w="0" w:type="dxa"/>
+            </w:tcMar>
+            <w:tcBorders>
+              <w:top w:val="nil"/>
+              <w:bottom w:val="single" w:sz="5" w:space="0" w:color="CBD5E1"/>
+              <w:start w:val="nil"/>
+              <w:end w:val="nil"/>
+            </w:tcBorders>
+          </w:tcPr>
+          <w:p>
+            <w:pPr>
+              <w:spacing w:before="0" w:after="0" w:line="240" w:lineRule="auto"/>
+            </w:pPr>
+            <w:r>
+              <w:t xml:space="preserve"> </w:t>
+            </w:r>
+          </w:p>
+        </w:tc>
+      </w:tr>
+      <w:tr>
+        <w:trPr>
+          <w:trHeight w:val="510" w:hRule="atLeast"/>
+        </w:trPr>
+        <w:tc>
+          <w:tcPr>
+            <w:tcW w:type="dxa" w:w="9865"/>
+            <w:tcMar>
+              <w:top w:w="0" w:type="dxa"/>
+              <w:start w:w="0" w:type="dxa"/>
+              <w:bottom w:w="0" w:type="dxa"/>
+              <w:end w:w="0" w:type="dxa"/>
+            </w:tcMar>
+            <w:tcBorders>
+              <w:top w:val="nil"/>
+              <w:bottom w:val="single" w:sz="5" w:space="0" w:color="CBD5E1"/>
+              <w:start w:val="nil"/>
+              <w:end w:val="nil"/>
+            </w:tcBorders>
+          </w:tcPr>
+          <w:p>
+            <w:pPr>
+              <w:spacing w:before="0" w:after="20" w:line="240" w:lineRule="auto"/>
+            </w:pPr>
+            <w:r>
+              <w:t xml:space="preserve"> </w:t>
+            </w:r>
+          </w:p>
+        </w:tc>
+      </w:tr>
+    </w:tbl>
+    <w:p>
+      <w:pPr>
+        <w:keepNext w:val="0"/>
+        <w:keepLines w:val="0"/>
+        <w:spacing w:before="0" w:after="60" w:line="293" w:lineRule="auto"/>
+      </w:pPr>
+      <w:r>
+        <w:rPr>
+          <w:rFonts w:ascii="Arial Unicode MS" w:hAnsi="Arial Unicode MS" w:eastAsia="Arial Unicode MS"/>
+          <w:b w:val="0"/>
+          <w:i w:val="0"/>
+          <w:color w:val="1A2340"/>
+          <w:sz w:val="22"/>
+        </w:rPr>
+        <w:t>生活練習不計分、不列學習關卡；不用真的發通知或交私訊。</w:t>
+      </w:r>
+    </w:p>
+    <w:p>
+      <w:pPr>
+        <w:keepNext/>
+        <w:keepLines w:val="0"/>
+        <w:spacing w:before="100" w:after="100" w:line="293" w:lineRule="auto"/>
+      </w:pPr>
+      <w:r>
+        <w:rPr>
+          <w:rFonts w:ascii="JetBrains Mono" w:hAnsi="JetBrains Mono" w:eastAsia="Arial Unicode MS"/>
+          <w:b/>
+          <w:i w:val="0"/>
+          <w:color w:val="1D4ED8"/>
+          <w:sz w:val="30"/>
+        </w:rPr>
+        <w:t>下週</w:t>
+      </w:r>
+      <w:r>
+        <w:rPr>
+          <w:rFonts w:ascii="Arial Unicode MS" w:hAnsi="Arial Unicode MS" w:eastAsia="Arial Unicode MS"/>
+          <w:b w:val="0"/>
+          <w:i w:val="0"/>
+          <w:color w:val="1D4ED8"/>
+          <w:sz w:val="30"/>
+        </w:rPr>
+        <w:t xml:space="preserve">  </w:t>
+      </w:r>
+      <w:r>
+        <w:rPr>
+          <w:rFonts w:ascii="Arial Unicode MS" w:hAnsi="Arial Unicode MS" w:eastAsia="Arial Unicode MS"/>
+          <w:b/>
+          <w:i w:val="0"/>
+          <w:color w:val="1A2340"/>
+          <w:sz w:val="30"/>
+        </w:rPr>
+        <w:t>W5 雙人共作微故事短片</w:t>
+      </w:r>
+    </w:p>
+    <w:p>
+      <w:pPr>
+        <w:keepNext w:val="0"/>
+        <w:keepLines w:val="0"/>
+        <w:spacing w:before="0" w:after="60" w:line="293" w:lineRule="auto"/>
+      </w:pPr>
+      <w:r>
+        <w:rPr>
+          <w:rFonts w:ascii="Arial Unicode MS" w:hAnsi="Arial Unicode MS" w:eastAsia="Arial Unicode MS"/>
+          <w:b w:val="0"/>
+          <w:i w:val="0"/>
+          <w:color w:val="1A2340"/>
+          <w:sz w:val="22"/>
+        </w:rPr>
+        <w:t>搭檔座號＿＿＿；選用＿＿＿的圖卡，□ 原作者同意共用。下框記想先呈現哪個細節；8 秒影片或圖片配時間皆可。兩人各保留圖像與來源。</w:t>
+      </w:r>
+    </w:p>
+    <w:tbl>
+      <w:tblPr>
+        <w:tblW w:type="dxa" w:w="9865"/>
+        <w:jc w:val="left"/>
+        <w:tblLayout w:type="fixed"/>
+        <w:tblLook w:firstColumn="1" w:firstRow="1" w:lastColumn="0" w:lastRow="0" w:noHBand="0" w:noVBand="1" w:val="04A0"/>
+        <w:tblInd w:type="dxa" w:w="0"/>
+      </w:tblPr>
+      <w:tblGrid>
+        <w:gridCol w:w="9865"/>
+      </w:tblGrid>
+      <w:tr>
+        <w:trPr>
+          <w:trHeight w:val="964" w:hRule="atLeast"/>
+        </w:trPr>
+        <w:tc>
+          <w:tcPr>
+            <w:tcW w:type="dxa" w:w="9865"/>
+            <w:tcMar>
+              <w:top w:w="80" w:type="dxa"/>
+              <w:start w:w="100" w:type="dxa"/>
+              <w:bottom w:w="80" w:type="dxa"/>
+              <w:end w:w="100" w:type="dxa"/>
+            </w:tcMar>
+            <w:tcBorders>
+              <w:top w:val="single" w:sz="5" w:space="0" w:color="CBD5E1"/>
+              <w:bottom w:val="single" w:sz="5" w:space="0" w:color="CBD5E1"/>
+              <w:start w:val="single" w:sz="5" w:space="0" w:color="CBD5E1"/>
+              <w:end w:val="single" w:sz="5" w:space="0" w:color="CBD5E1"/>
+            </w:tcBorders>
+          </w:tcPr>
+          <w:p/>
+        </w:tc>
+      </w:tr>
+    </w:tbl>
+    <w:p>
+      <w:pPr>
+        <w:keepNext w:val="0"/>
+        <w:keepLines w:val="0"/>
+        <w:spacing w:before="0" w:after="0" w:line="293" w:lineRule="auto"/>
       </w:pPr>
       <w:r>
         <w:rPr>
           <w:rFonts w:ascii="Arial Unicode MS" w:hAnsi="Arial Unicode MS" w:eastAsia="Arial Unicode MS"/>
           <w:b/>
           <w:i w:val="0"/>
-          <w:color w:val="1D4ED8"/>
+          <w:color w:val="1A2340"/>
           <w:sz w:val="22"/>
         </w:rPr>
-        <w:t>收件：只拍自己的頁面上傳 Classroom，確認已繳交，再把整本交回；不拍同學。</w:t>
+        <w:t>只拍自己的 4 頁上傳 Classroom；數位者加 V1、V2（有改才交）。確認已繳交，再把紙本整本交老師保存。不拍同學。</w:t>
       </w:r>
     </w:p>
     <w:sectPr>

</xml_diff>